<commit_message>
Replace the downloadable resume with the updated file
The site resume now matches the current record: Upwork freelance work, 8+ years, and British spelling, without the InnerSpace claim.

Co-authored-by: Shahnshah <shahnshahmalik@users.noreply.github.com>
</commit_message>
<xml_diff>
--- a/public/Shahnshah-Malik-Resume.docx
+++ b/public/Shahnshah-Malik-Resume.docx
@@ -4,85 +4,68 @@
   <w:body>
     <w:p>
       <w:pPr>
-        <w:spacing w:before="0" w:after="0" w:line="240" w:lineRule="auto"/>
+        <w:spacing w:after="40" w:before="0" w:line="259" w:lineRule="auto"/>
         <w:jc w:val="center"/>
       </w:pPr>
       <w:r>
         <w:rPr>
-          <w:rFonts w:ascii="Calibri" w:hAnsi="Calibri" w:eastAsia="Calibri"/>
+          <w:rFonts w:ascii="Calibri" w:hAnsi="Calibri"/>
           <w:b/>
-          <w:i w:val="0"/>
-          <w:color w:val="1A2B3C"/>
-          <w:sz w:val="36"/>
+          <w:sz w:val="32"/>
         </w:rPr>
         <w:t>SHAHNSHAH MALIK</w:t>
       </w:r>
     </w:p>
     <w:p>
       <w:pPr>
-        <w:spacing w:before="0" w:after="40" w:line="240" w:lineRule="auto"/>
+        <w:spacing w:after="40" w:before="0" w:line="259" w:lineRule="auto"/>
         <w:jc w:val="center"/>
       </w:pPr>
       <w:r>
         <w:rPr>
-          <w:rFonts w:ascii="Calibri" w:hAnsi="Calibri" w:eastAsia="Calibri"/>
+          <w:rFonts w:ascii="Calibri" w:hAnsi="Calibri"/>
           <w:b w:val="0"/>
-          <w:i w:val="0"/>
-          <w:color w:val="1F4E79"/>
-          <w:sz w:val="22"/>
+          <w:sz w:val="21"/>
         </w:rPr>
-        <w:t>Senior Angular Developer  ·  SaaS dashboards and data visualization</w:t>
+        <w:t>Front-end engineer  ·  Angular SaaS</w:t>
       </w:r>
     </w:p>
     <w:p>
       <w:pPr>
-        <w:spacing w:before="0" w:after="120" w:line="240" w:lineRule="auto"/>
+        <w:spacing w:after="20" w:before="0" w:line="259" w:lineRule="auto"/>
         <w:jc w:val="center"/>
       </w:pPr>
       <w:r>
         <w:rPr>
-          <w:rFonts w:ascii="Calibri" w:hAnsi="Calibri" w:eastAsia="Calibri"/>
+          <w:rFonts w:ascii="Calibri" w:hAnsi="Calibri"/>
           <w:b w:val="0"/>
-          <w:i w:val="0"/>
-          <w:color w:val="4A5563"/>
-          <w:sz w:val="20"/>
+          <w:sz w:val="19"/>
         </w:rPr>
         <w:t>New Delhi, India  ·  +91 888 267 0684  ·  shahenshah.malik@hotmail.com</w:t>
       </w:r>
+    </w:p>
+    <w:p>
+      <w:pPr>
+        <w:spacing w:after="160" w:before="0" w:line="259" w:lineRule="auto"/>
+        <w:jc w:val="center"/>
+      </w:pPr>
       <w:r>
         <w:rPr>
-          <w:rFonts w:ascii="Calibri" w:hAnsi="Calibri" w:eastAsia="Calibri"/>
+          <w:rFonts w:ascii="Calibri" w:hAnsi="Calibri"/>
           <w:b w:val="0"/>
-          <w:i w:val="0"/>
-          <w:color w:val="1A1A1A"/>
-          <w:sz w:val="20"/>
-        </w:rPr>
-        <w:br/>
-      </w:r>
-      <w:r>
-        <w:rPr>
-          <w:rFonts w:ascii="Calibri" w:hAnsi="Calibri" w:eastAsia="Calibri"/>
-          <w:b w:val="0"/>
-          <w:i w:val="0"/>
-          <w:color w:val="4A5563"/>
-          <w:sz w:val="20"/>
+          <w:sz w:val="18"/>
         </w:rPr>
         <w:t>linkedin.com/in/shahnshahmalik  ·  github.com/shahnshahmalik  ·  upwork.com/freelancers/~012dfed8a66d5a977a</w:t>
       </w:r>
     </w:p>
     <w:p>
       <w:pPr>
-        <w:spacing w:before="200" w:after="60" w:line="240" w:lineRule="auto"/>
-        <w:pBdr>
-          <w:bottom w:val="single" w:sz="8" w:space="1" w:color="1F4E79"/>
-        </w:pBdr>
+        <w:spacing w:after="60" w:before="200" w:line="259" w:lineRule="auto"/>
       </w:pPr>
       <w:r>
         <w:rPr>
-          <w:rFonts w:ascii="Calibri" w:hAnsi="Calibri" w:eastAsia="Calibri"/>
+          <w:rFonts w:ascii="Calibri" w:hAnsi="Calibri"/>
           <w:b/>
-          <w:i w:val="0"/>
-          <w:color w:val="1F4E79"/>
           <w:sz w:val="22"/>
         </w:rPr>
         <w:t>SUMMARY</w:t>
@@ -90,32 +73,25 @@
     </w:p>
     <w:p>
       <w:pPr>
-        <w:spacing w:before="20" w:after="20" w:line="252" w:lineRule="auto"/>
+        <w:spacing w:after="80" w:before="0" w:line="259" w:lineRule="auto"/>
       </w:pPr>
       <w:r>
         <w:rPr>
-          <w:rFonts w:ascii="Calibri" w:hAnsi="Calibri" w:eastAsia="Calibri"/>
+          <w:rFonts w:ascii="Calibri" w:hAnsi="Calibri"/>
           <w:b w:val="0"/>
-          <w:i w:val="0"/>
-          <w:color w:val="1A1A1A"/>
-          <w:sz w:val="21"/>
+          <w:sz w:val="20"/>
         </w:rPr>
-        <w:t>Front-end engineer with 8 years building Angular SaaS products for occupancy analytics, ad tracking, data governance, and property analysis. I take a product from a blank repo to a shipped dashboard: interactive maps, charts, role-based views, and forms that hold up under real data. At InnerSpace I cut dashboard load time by about 40% with lazy loading and tighter data fetching.</w:t>
+        <w:t>Front-end engineer with 8+ years shipping Angular SaaS — occupancy and property analytics, ad-tracking dashboards, and enterprise data-governance UIs. Strong at turning Figma, PSDs, and screenshots into production apps: TypeScript, RxJS, signals, Material, and chart/floor-plan tooling. Also builds AI-facing UI (chat, completion, local models). Bids as an individual contractor on Upwork for long-term Angular work.</w:t>
       </w:r>
     </w:p>
     <w:p>
       <w:pPr>
-        <w:spacing w:before="200" w:after="60" w:line="240" w:lineRule="auto"/>
-        <w:pBdr>
-          <w:bottom w:val="single" w:sz="8" w:space="1" w:color="1F4E79"/>
-        </w:pBdr>
+        <w:spacing w:after="60" w:before="200" w:line="259" w:lineRule="auto"/>
       </w:pPr>
       <w:r>
         <w:rPr>
-          <w:rFonts w:ascii="Calibri" w:hAnsi="Calibri" w:eastAsia="Calibri"/>
+          <w:rFonts w:ascii="Calibri" w:hAnsi="Calibri"/>
           <w:b/>
-          <w:i w:val="0"/>
-          <w:color w:val="1F4E79"/>
           <w:sz w:val="22"/>
         </w:rPr>
         <w:t>EXPERIENCE</w:t>
@@ -123,337 +99,284 @@
     </w:p>
     <w:p>
       <w:pPr>
-        <w:spacing w:before="120" w:after="0" w:line="240" w:lineRule="auto"/>
+        <w:spacing w:after="20" w:before="160" w:line="259" w:lineRule="auto"/>
       </w:pPr>
       <w:r>
         <w:rPr>
-          <w:rFonts w:ascii="Calibri" w:hAnsi="Calibri" w:eastAsia="Calibri"/>
+          <w:rFonts w:ascii="Calibri" w:hAnsi="Calibri"/>
           <w:b/>
-          <w:i w:val="0"/>
-          <w:color w:val="1A2B3C"/>
-          <w:sz w:val="22"/>
+          <w:sz w:val="21"/>
         </w:rPr>
-        <w:t>Front-end engineer, InnerSpace</w:t>
-      </w:r>
-      <w:r>
-        <w:rPr>
-          <w:rFonts w:ascii="Calibri" w:hAnsi="Calibri" w:eastAsia="Calibri"/>
-          <w:b w:val="0"/>
-          <w:i w:val="0"/>
-          <w:color w:val="4A5563"/>
-          <w:sz w:val="20"/>
-        </w:rPr>
-        <w:t xml:space="preserve">   Sep 2022 – Present  ·  Freelance, Canada</w:t>
+        <w:t>Front-end engineer, Upwork</w:t>
       </w:r>
     </w:p>
     <w:p>
       <w:pPr>
-        <w:spacing w:before="0" w:after="20" w:line="240" w:lineRule="auto"/>
+        <w:spacing w:after="60" w:before="0" w:line="259" w:lineRule="auto"/>
       </w:pPr>
       <w:r>
         <w:rPr>
-          <w:rFonts w:ascii="Calibri" w:hAnsi="Calibri" w:eastAsia="Calibri"/>
+          <w:rFonts w:ascii="Calibri" w:hAnsi="Calibri"/>
           <w:b w:val="0"/>
-          <w:i/>
-          <w:color w:val="4A5563"/>
-          <w:sz w:val="20"/>
+          <w:sz w:val="19"/>
         </w:rPr>
-        <w:t>Occupancy analytics SaaS for enterprise office space. Angular, TypeScript, FabricJS, RxJS, GoodData.</w:t>
+        <w:t>Sep 2022 – Present  ·  Freelance (individual)  ·  Long-term Angular SaaS contracts</w:t>
       </w:r>
     </w:p>
     <w:p>
       <w:pPr>
-        <w:spacing w:before="20" w:after="20" w:line="252" w:lineRule="auto"/>
-        <w:ind w:left="288" w:hanging="216"/>
+        <w:spacing w:after="40" w:before="0"/>
+        <w:ind w:left="216"/>
       </w:pPr>
       <w:r>
         <w:rPr>
-          <w:rFonts w:ascii="Calibri" w:hAnsi="Calibri" w:eastAsia="Calibri"/>
+          <w:rFonts w:ascii="Calibri" w:hAnsi="Calibri"/>
           <w:b w:val="0"/>
-          <w:i w:val="0"/>
-          <w:color w:val="1A1A1A"/>
-          <w:sz w:val="21"/>
+          <w:sz w:val="20"/>
         </w:rPr>
-        <w:t>•  Built an interactive floor-plan tool so users can upload a plan and draw, edit, and style zones on the image with FabricJS.</w:t>
+        <w:t>•  Contract front-end work on Angular SaaS products: dashboards, interactive floor plans (FabricJS), and role-based analytics views (GoodData).</w:t>
       </w:r>
     </w:p>
     <w:p>
       <w:pPr>
-        <w:spacing w:before="20" w:after="20" w:line="252" w:lineRule="auto"/>
-        <w:ind w:left="288" w:hanging="216"/>
+        <w:spacing w:after="40" w:before="0"/>
+        <w:ind w:left="216"/>
       </w:pPr>
       <w:r>
         <w:rPr>
-          <w:rFonts w:ascii="Calibri" w:hAnsi="Calibri" w:eastAsia="Calibri"/>
+          <w:rFonts w:ascii="Calibri" w:hAnsi="Calibri"/>
           <w:b w:val="0"/>
-          <w:i w:val="0"/>
-          <w:color w:val="1A1A1A"/>
-          <w:sz w:val="21"/>
+          <w:sz w:val="20"/>
         </w:rPr>
-        <w:t>•  Shipped a role-based occupancy dashboard on GoodData so each customer type only sees their own data.</w:t>
+        <w:t>•  Own design-to-production delivery — components, states, live data (RxJS), and maintainable module structure for multi-year products.</w:t>
       </w:r>
     </w:p>
     <w:p>
       <w:pPr>
-        <w:spacing w:before="20" w:after="20" w:line="252" w:lineRule="auto"/>
-        <w:ind w:left="288" w:hanging="216"/>
+        <w:spacing w:after="40" w:before="0"/>
+        <w:ind w:left="216"/>
       </w:pPr>
       <w:r>
         <w:rPr>
-          <w:rFonts w:ascii="Calibri" w:hAnsi="Calibri" w:eastAsia="Calibri"/>
+          <w:rFonts w:ascii="Calibri" w:hAnsi="Calibri"/>
           <w:b w:val="0"/>
-          <w:i w:val="0"/>
-          <w:color w:val="1A1A1A"/>
-          <w:sz w:val="21"/>
+          <w:sz w:val="20"/>
         </w:rPr>
-        <w:t>•  Cut dashboard load time by about 40% with lazy loading, Angular services, and RxJS for live updates.</w:t>
+        <w:t>•  Improve application load behaviour with lazy loading and tighter data fetching on dashboard-heavy UIs.</w:t>
       </w:r>
     </w:p>
     <w:p>
       <w:pPr>
-        <w:spacing w:before="120" w:after="0" w:line="240" w:lineRule="auto"/>
+        <w:spacing w:after="40" w:before="0"/>
+        <w:ind w:left="216"/>
       </w:pPr>
       <w:r>
         <w:rPr>
-          <w:rFonts w:ascii="Calibri" w:hAnsi="Calibri" w:eastAsia="Calibri"/>
-          <w:b/>
-          <w:i w:val="0"/>
-          <w:color w:val="1A2B3C"/>
-          <w:sz w:val="22"/>
-        </w:rPr>
-        <w:t>Front-end engineer, Appcarry</w:t>
-      </w:r>
-      <w:r>
-        <w:rPr>
-          <w:rFonts w:ascii="Calibri" w:hAnsi="Calibri" w:eastAsia="Calibri"/>
+          <w:rFonts w:ascii="Calibri" w:hAnsi="Calibri"/>
           <w:b w:val="0"/>
-          <w:i w:val="0"/>
-          <w:color w:val="4A5563"/>
           <w:sz w:val="20"/>
         </w:rPr>
-        <w:t xml:space="preserve">   May 2020 – Oct 2024  ·  Part-time, India</w:t>
+        <w:t>•  Prefer long engagements (3+ months) with verified US/Canada clients; work as an individual, not an agency.</w:t>
       </w:r>
     </w:p>
     <w:p>
       <w:pPr>
-        <w:spacing w:before="0" w:after="20" w:line="240" w:lineRule="auto"/>
+        <w:spacing w:after="20" w:before="160" w:line="259" w:lineRule="auto"/>
       </w:pPr>
       <w:r>
         <w:rPr>
-          <w:rFonts w:ascii="Calibri" w:hAnsi="Calibri" w:eastAsia="Calibri"/>
-          <w:b w:val="0"/>
-          <w:i/>
-          <w:color w:val="4A5563"/>
-          <w:sz w:val="20"/>
+          <w:rFonts w:ascii="Calibri" w:hAnsi="Calibri"/>
+          <w:b/>
+          <w:sz w:val="21"/>
         </w:rPr>
-        <w:t>Performance-marketing and ad-tracking SaaS. Ran alongside full-time work from 2020 to 2022.</w:t>
+        <w:t>Front-end engineer, Appcarry</w:t>
       </w:r>
     </w:p>
     <w:p>
       <w:pPr>
-        <w:spacing w:before="20" w:after="20" w:line="252" w:lineRule="auto"/>
-        <w:ind w:left="288" w:hanging="216"/>
+        <w:spacing w:after="60" w:before="0" w:line="259" w:lineRule="auto"/>
       </w:pPr>
       <w:r>
         <w:rPr>
-          <w:rFonts w:ascii="Calibri" w:hAnsi="Calibri" w:eastAsia="Calibri"/>
+          <w:rFonts w:ascii="Calibri" w:hAnsi="Calibri"/>
           <w:b w:val="0"/>
-          <w:i w:val="0"/>
-          <w:color w:val="1A1A1A"/>
-          <w:sz w:val="21"/>
+          <w:sz w:val="19"/>
         </w:rPr>
-        <w:t>•  Built analytics dashboards and charted reports for impressions, events, conversions, and installs.</w:t>
+        <w:t>May 2020 – Oct 2024  ·  Part-time  ·  India</w:t>
       </w:r>
     </w:p>
     <w:p>
       <w:pPr>
-        <w:spacing w:before="20" w:after="20" w:line="252" w:lineRule="auto"/>
-        <w:ind w:left="288" w:hanging="216"/>
+        <w:spacing w:after="40" w:before="0"/>
+        <w:ind w:left="216"/>
       </w:pPr>
       <w:r>
         <w:rPr>
-          <w:rFonts w:ascii="Calibri" w:hAnsi="Calibri" w:eastAsia="Calibri"/>
+          <w:rFonts w:ascii="Calibri" w:hAnsi="Calibri"/>
           <w:b w:val="0"/>
-          <w:i w:val="0"/>
-          <w:color w:val="1A1A1A"/>
-          <w:sz w:val="21"/>
+          <w:sz w:val="20"/>
         </w:rPr>
-        <w:t>•  Designed filterable report UIs and dynamic forms, and split the app into modules so it stayed maintainable.</w:t>
+        <w:t>•  Built performance-marketing and ad-tracking dashboards for impressions, events, conversions, and installs (Angular 12 → 17).</w:t>
       </w:r>
     </w:p>
     <w:p>
       <w:pPr>
-        <w:spacing w:before="20" w:after="20" w:line="252" w:lineRule="auto"/>
-        <w:ind w:left="288" w:hanging="216"/>
+        <w:spacing w:after="40" w:before="0"/>
+        <w:ind w:left="216"/>
       </w:pPr>
       <w:r>
         <w:rPr>
-          <w:rFonts w:ascii="Calibri" w:hAnsi="Calibri" w:eastAsia="Calibri"/>
+          <w:rFonts w:ascii="Calibri" w:hAnsi="Calibri"/>
           <w:b w:val="0"/>
-          <w:i w:val="0"/>
-          <w:color w:val="1A1A1A"/>
-          <w:sz w:val="21"/>
+          <w:sz w:val="20"/>
         </w:rPr>
-        <w:t>•  Covered the app with unit tests and performance work so new features had a stable base.</w:t>
+        <w:t>•  Designed filterable report UIs and dynamic forms; modularised the app so it stayed maintainable as features grew.</w:t>
       </w:r>
     </w:p>
     <w:p>
       <w:pPr>
-        <w:spacing w:before="120" w:after="0" w:line="240" w:lineRule="auto"/>
+        <w:spacing w:after="40" w:before="0"/>
+        <w:ind w:left="216"/>
       </w:pPr>
       <w:r>
         <w:rPr>
-          <w:rFonts w:ascii="Calibri" w:hAnsi="Calibri" w:eastAsia="Calibri"/>
-          <w:b/>
-          <w:i w:val="0"/>
-          <w:color w:val="1A2B3C"/>
-          <w:sz w:val="22"/>
-        </w:rPr>
-        <w:t>Senior front-end developer, Prospecta Software</w:t>
-      </w:r>
-      <w:r>
-        <w:rPr>
-          <w:rFonts w:ascii="Calibri" w:hAnsi="Calibri" w:eastAsia="Calibri"/>
+          <w:rFonts w:ascii="Calibri" w:hAnsi="Calibri"/>
           <w:b w:val="0"/>
-          <w:i w:val="0"/>
-          <w:color w:val="4A5563"/>
           <w:sz w:val="20"/>
         </w:rPr>
-        <w:t xml:space="preserve">   Oct 2020 – Sep 2022  ·  Full-time, India</w:t>
+        <w:t>•  Added AI-facing UI: chat interfaces, OpenAI-style API integration, recommendations and text completion; local models via Ollama where useful.</w:t>
       </w:r>
     </w:p>
     <w:p>
       <w:pPr>
-        <w:spacing w:before="0" w:after="20" w:line="240" w:lineRule="auto"/>
+        <w:spacing w:after="40" w:before="0"/>
+        <w:ind w:left="216"/>
       </w:pPr>
       <w:r>
         <w:rPr>
-          <w:rFonts w:ascii="Calibri" w:hAnsi="Calibri" w:eastAsia="Calibri"/>
+          <w:rFonts w:ascii="Calibri" w:hAnsi="Calibri"/>
           <w:b w:val="0"/>
-          <w:i/>
-          <w:color w:val="4A5563"/>
           <w:sz w:val="20"/>
         </w:rPr>
-        <w:t>Enterprise data-governance SaaS fed by a SAP interface.</w:t>
+        <w:t>•  Stabilised delivery with unit tests and performance work so new features landed on a reliable base.</w:t>
       </w:r>
     </w:p>
     <w:p>
       <w:pPr>
-        <w:spacing w:before="20" w:after="20" w:line="252" w:lineRule="auto"/>
-        <w:ind w:left="288" w:hanging="216"/>
+        <w:spacing w:after="20" w:before="160" w:line="259" w:lineRule="auto"/>
       </w:pPr>
       <w:r>
         <w:rPr>
-          <w:rFonts w:ascii="Calibri" w:hAnsi="Calibri" w:eastAsia="Calibri"/>
-          <w:b w:val="0"/>
-          <w:i w:val="0"/>
-          <w:color w:val="1A1A1A"/>
+          <w:rFonts w:ascii="Calibri" w:hAnsi="Calibri"/>
+          <w:b/>
           <w:sz w:val="21"/>
         </w:rPr>
-        <w:t>•  Improved the UI across a suite of data integration, quality, and governance products handling large incoming datasets.</w:t>
+        <w:t>Senior front-end developer, Prospecta Software</w:t>
       </w:r>
     </w:p>
     <w:p>
       <w:pPr>
-        <w:spacing w:before="20" w:after="20" w:line="252" w:lineRule="auto"/>
-        <w:ind w:left="288" w:hanging="216"/>
+        <w:spacing w:after="60" w:before="0" w:line="259" w:lineRule="auto"/>
       </w:pPr>
       <w:r>
         <w:rPr>
-          <w:rFonts w:ascii="Calibri" w:hAnsi="Calibri" w:eastAsia="Calibri"/>
+          <w:rFonts w:ascii="Calibri" w:hAnsi="Calibri"/>
           <w:b w:val="0"/>
-          <w:i w:val="0"/>
-          <w:color w:val="1A1A1A"/>
-          <w:sz w:val="21"/>
+          <w:sz w:val="19"/>
         </w:rPr>
-        <w:t>•  Kept screens responsive and aligned with how operators actually move through a 360-degree data view.</w:t>
+        <w:t>Oct 2020 – Sep 2022  ·  Full-time  ·  India</w:t>
       </w:r>
     </w:p>
     <w:p>
       <w:pPr>
-        <w:spacing w:before="120" w:after="0" w:line="240" w:lineRule="auto"/>
+        <w:spacing w:after="40" w:before="0"/>
+        <w:ind w:left="216"/>
       </w:pPr>
       <w:r>
         <w:rPr>
-          <w:rFonts w:ascii="Calibri" w:hAnsi="Calibri" w:eastAsia="Calibri"/>
-          <w:b/>
-          <w:i w:val="0"/>
-          <w:color w:val="1A2B3C"/>
-          <w:sz w:val="22"/>
-        </w:rPr>
-        <w:t>Senior front-end developer, Estater</w:t>
-      </w:r>
-      <w:r>
-        <w:rPr>
-          <w:rFonts w:ascii="Calibri" w:hAnsi="Calibri" w:eastAsia="Calibri"/>
+          <w:rFonts w:ascii="Calibri" w:hAnsi="Calibri"/>
           <w:b w:val="0"/>
-          <w:i w:val="0"/>
-          <w:color w:val="4A5563"/>
           <w:sz w:val="20"/>
         </w:rPr>
-        <w:t xml:space="preserve">   Feb 2018 – May 2020  ·  Full-time, India</w:t>
+        <w:t>•  Data-governance and integration UIs on a SAP-fed enterprise platform handling large incoming datasets.</w:t>
       </w:r>
     </w:p>
     <w:p>
       <w:pPr>
-        <w:spacing w:before="0" w:after="20" w:line="240" w:lineRule="auto"/>
+        <w:spacing w:after="40" w:before="0"/>
+        <w:ind w:left="216"/>
       </w:pPr>
       <w:r>
         <w:rPr>
-          <w:rFonts w:ascii="Calibri" w:hAnsi="Calibri" w:eastAsia="Calibri"/>
+          <w:rFonts w:ascii="Calibri" w:hAnsi="Calibri"/>
           <w:b w:val="0"/>
-          <w:i/>
-          <w:color w:val="4A5563"/>
           <w:sz w:val="20"/>
         </w:rPr>
-        <w:t>Land survey and property analytics for Kuwait and Bahrain.</w:t>
+        <w:t>•  Improved responsiveness and operator workflows across quality, integration, and 360° data views.</w:t>
       </w:r>
     </w:p>
     <w:p>
       <w:pPr>
-        <w:spacing w:before="20" w:after="20" w:line="252" w:lineRule="auto"/>
-        <w:ind w:left="288" w:hanging="216"/>
+        <w:spacing w:after="20" w:before="160" w:line="259" w:lineRule="auto"/>
       </w:pPr>
       <w:r>
         <w:rPr>
-          <w:rFonts w:ascii="Calibri" w:hAnsi="Calibri" w:eastAsia="Calibri"/>
-          <w:b w:val="0"/>
-          <w:i w:val="0"/>
-          <w:color w:val="1A1A1A"/>
+          <w:rFonts w:ascii="Calibri" w:hAnsi="Calibri"/>
+          <w:b/>
           <w:sz w:val="21"/>
         </w:rPr>
-        <w:t>•  Built customer-facing tools for catchment analysis, price trends, and property benchmarking in the GCC.</w:t>
+        <w:t>Senior front-end developer, Estater</w:t>
       </w:r>
     </w:p>
     <w:p>
       <w:pPr>
-        <w:spacing w:before="20" w:after="20" w:line="252" w:lineRule="auto"/>
-        <w:ind w:left="288" w:hanging="216"/>
+        <w:spacing w:after="60" w:before="0" w:line="259" w:lineRule="auto"/>
       </w:pPr>
       <w:r>
         <w:rPr>
-          <w:rFonts w:ascii="Calibri" w:hAnsi="Calibri" w:eastAsia="Calibri"/>
+          <w:rFonts w:ascii="Calibri" w:hAnsi="Calibri"/>
           <w:b w:val="0"/>
-          <w:i w:val="0"/>
-          <w:color w:val="1A1A1A"/>
-          <w:sz w:val="21"/>
+          <w:sz w:val="19"/>
         </w:rPr>
-        <w:t>•  Digitized survey workflows, including CSV upload from legacy documents, so field data landed in the product instead of spreadsheets.</w:t>
+        <w:t>Feb 2018 – May 2020  ·  Full-time  ·  India</w:t>
       </w:r>
     </w:p>
     <w:p>
       <w:pPr>
-        <w:spacing w:before="200" w:after="60" w:line="240" w:lineRule="auto"/>
-        <w:pBdr>
-          <w:bottom w:val="single" w:sz="8" w:space="1" w:color="1F4E79"/>
-        </w:pBdr>
+        <w:spacing w:after="40" w:before="0"/>
+        <w:ind w:left="216"/>
       </w:pPr>
       <w:r>
         <w:rPr>
-          <w:rFonts w:ascii="Calibri" w:hAnsi="Calibri" w:eastAsia="Calibri"/>
+          <w:rFonts w:ascii="Calibri" w:hAnsi="Calibri"/>
+          <w:b w:val="0"/>
+          <w:sz w:val="20"/>
+        </w:rPr>
+        <w:t>•  Property-analysis tools for Kuwait and Bahrain: catchment analysis, price trends, and benchmarking.</w:t>
+      </w:r>
+    </w:p>
+    <w:p>
+      <w:pPr>
+        <w:spacing w:after="40" w:before="0"/>
+        <w:ind w:left="216"/>
+      </w:pPr>
+      <w:r>
+        <w:rPr>
+          <w:rFonts w:ascii="Calibri" w:hAnsi="Calibri"/>
+          <w:b w:val="0"/>
+          <w:sz w:val="20"/>
+        </w:rPr>
+        <w:t>•  Digitised survey workflows, including CSV upload from legacy documents, so field data landed in the product instead of spreadsheets.</w:t>
+      </w:r>
+    </w:p>
+    <w:p>
+      <w:pPr>
+        <w:spacing w:after="60" w:before="200" w:line="259" w:lineRule="auto"/>
+      </w:pPr>
+      <w:r>
+        <w:rPr>
+          <w:rFonts w:ascii="Calibri" w:hAnsi="Calibri"/>
           <w:b/>
-          <w:i w:val="0"/>
-          <w:color w:val="1F4E79"/>
           <w:sz w:val="22"/>
         </w:rPr>
         <w:t>SKILLS</w:t>
@@ -461,32 +384,25 @@
     </w:p>
     <w:p>
       <w:pPr>
-        <w:spacing w:before="20" w:after="20" w:line="252" w:lineRule="auto"/>
+        <w:spacing w:after="80" w:before="0" w:line="259" w:lineRule="auto"/>
       </w:pPr>
       <w:r>
         <w:rPr>
-          <w:rFonts w:ascii="Calibri" w:hAnsi="Calibri" w:eastAsia="Calibri"/>
+          <w:rFonts w:ascii="Calibri" w:hAnsi="Calibri"/>
           <w:b w:val="0"/>
-          <w:i w:val="0"/>
-          <w:color w:val="1A1A1A"/>
-          <w:sz w:val="21"/>
+          <w:sz w:val="20"/>
         </w:rPr>
-        <w:t>Angular (12–18), TypeScript, RxJS, signals, standalone components, Angular Material. HTML, SCSS, Tailwind, design systems and theming. Data visualization with D3.js, Chart.js, Highcharts, and GoodData. REST, GraphQL, WebSockets. Unit testing with Jasmine and Karma. Some React, and UI work around chat and OpenAI-style APIs.</w:t>
+        <w:t>Angular (v2–v20), TypeScript, RxJS, signals, standalone components, Angular Material, SASS. Design-to-production (Figma, PSD, screenshots). Visualisation: FabricJS, GoodData, D3.js, Chart.js, Highcharts. REST, GraphQL, WebSockets. Tests: Jasmine, Karma, Jest, Cypress. Also React, Storybook, Laravel, CodeIgniter, Express.js, LoopBack. AI UI: chat, OpenAI-style APIs, Ollama.</w:t>
       </w:r>
     </w:p>
     <w:p>
       <w:pPr>
-        <w:spacing w:before="200" w:after="60" w:line="240" w:lineRule="auto"/>
-        <w:pBdr>
-          <w:bottom w:val="single" w:sz="8" w:space="1" w:color="1F4E79"/>
-        </w:pBdr>
+        <w:spacing w:after="60" w:before="200" w:line="259" w:lineRule="auto"/>
       </w:pPr>
       <w:r>
         <w:rPr>
-          <w:rFonts w:ascii="Calibri" w:hAnsi="Calibri" w:eastAsia="Calibri"/>
+          <w:rFonts w:ascii="Calibri" w:hAnsi="Calibri"/>
           <w:b/>
-          <w:i w:val="0"/>
-          <w:color w:val="1F4E79"/>
           <w:sz w:val="22"/>
         </w:rPr>
         <w:t>EDUCATION</w:t>
@@ -494,22 +410,20 @@
     </w:p>
     <w:p>
       <w:pPr>
-        <w:spacing w:before="40" w:after="0" w:line="252" w:lineRule="auto"/>
+        <w:spacing w:after="0" w:before="0" w:line="259" w:lineRule="auto"/>
       </w:pPr>
       <w:r>
         <w:rPr>
-          <w:rFonts w:ascii="Calibri" w:hAnsi="Calibri" w:eastAsia="Calibri"/>
+          <w:rFonts w:ascii="Calibri" w:hAnsi="Calibri"/>
           <w:b w:val="0"/>
-          <w:i w:val="0"/>
-          <w:color w:val="1A1A1A"/>
-          <w:sz w:val="21"/>
+          <w:sz w:val="20"/>
         </w:rPr>
         <w:t>Bachelor of Computer Applications, Jamia Hamdard University, New Delhi — 2012</w:t>
       </w:r>
     </w:p>
     <w:sectPr>
       <w:pgSz w:w="12240" w:h="15840"/>
-      <w:pgMar w:top="792" w:right="1008" w:bottom="720" w:left="1008" w:header="720" w:footer="720" w:gutter="0"/>
+      <w:pgMar w:top="792" w:right="936" w:bottom="792" w:left="936" w:header="720" w:footer="720" w:gutter="0"/>
       <w:cols w:space="720"/>
       <w:docGrid w:linePitch="360"/>
     </w:sectPr>

</xml_diff>

<commit_message>
Replace the resume with the formatted revision
Use the version with restored layout and skills grouped by practice area. Download links stay on the same path.

Co-authored-by: Shahnshah <shahnshahmalik@users.noreply.github.com>
</commit_message>
<xml_diff>
--- a/public/Shahnshah-Malik-Resume.docx
+++ b/public/Shahnshah-Malik-Resume.docx
@@ -4,68 +4,79 @@
   <w:body>
     <w:p>
       <w:pPr>
-        <w:spacing w:after="40" w:before="0" w:line="259" w:lineRule="auto"/>
+        <w:spacing w:before="0" w:after="0" w:line="259" w:lineRule="auto"/>
         <w:jc w:val="center"/>
       </w:pPr>
       <w:r>
         <w:rPr>
           <w:rFonts w:ascii="Calibri" w:hAnsi="Calibri"/>
           <w:b/>
-          <w:sz w:val="32"/>
+          <w:color w:val="1A2B3C"/>
+          <w:sz w:val="36"/>
         </w:rPr>
         <w:t>SHAHNSHAH MALIK</w:t>
       </w:r>
     </w:p>
     <w:p>
       <w:pPr>
-        <w:spacing w:after="40" w:before="0" w:line="259" w:lineRule="auto"/>
+        <w:spacing w:before="0" w:after="40" w:line="259" w:lineRule="auto"/>
         <w:jc w:val="center"/>
       </w:pPr>
       <w:r>
         <w:rPr>
           <w:rFonts w:ascii="Calibri" w:hAnsi="Calibri"/>
           <w:b w:val="0"/>
-          <w:sz w:val="21"/>
+          <w:color w:val="1F4E79"/>
+          <w:sz w:val="22"/>
         </w:rPr>
-        <w:t>Front-end engineer  ·  Angular SaaS</w:t>
+        <w:t>Front-end engineer  ·  Angular SaaS  ·  Design to production</w:t>
       </w:r>
     </w:p>
     <w:p>
       <w:pPr>
-        <w:spacing w:after="20" w:before="0" w:line="259" w:lineRule="auto"/>
+        <w:spacing w:before="0" w:after="120" w:line="259" w:lineRule="auto"/>
         <w:jc w:val="center"/>
       </w:pPr>
       <w:r>
         <w:rPr>
           <w:rFonts w:ascii="Calibri" w:hAnsi="Calibri"/>
           <w:b w:val="0"/>
-          <w:sz w:val="19"/>
+          <w:color w:val="4A5563"/>
+          <w:sz w:val="20"/>
         </w:rPr>
         <w:t>New Delhi, India  ·  +91 888 267 0684  ·  shahenshah.malik@hotmail.com</w:t>
       </w:r>
-    </w:p>
-    <w:p>
-      <w:pPr>
-        <w:spacing w:after="160" w:before="0" w:line="259" w:lineRule="auto"/>
-        <w:jc w:val="center"/>
-      </w:pPr>
       <w:r>
         <w:rPr>
           <w:rFonts w:ascii="Calibri" w:hAnsi="Calibri"/>
           <w:b w:val="0"/>
-          <w:sz w:val="18"/>
+          <w:color w:val="1A1A1A"/>
+          <w:sz w:val="20"/>
+        </w:rPr>
+        <w:br/>
+      </w:r>
+      <w:r>
+        <w:rPr>
+          <w:rFonts w:ascii="Calibri" w:hAnsi="Calibri"/>
+          <w:b w:val="0"/>
+          <w:color w:val="4A5563"/>
+          <w:sz w:val="20"/>
         </w:rPr>
         <w:t>linkedin.com/in/shahnshahmalik  ·  github.com/shahnshahmalik  ·  upwork.com/freelancers/~012dfed8a66d5a977a</w:t>
       </w:r>
     </w:p>
     <w:p>
       <w:pPr>
-        <w:spacing w:after="60" w:before="200" w:line="259" w:lineRule="auto"/>
+        <w:spacing w:before="200" w:after="60" w:line="259" w:lineRule="auto"/>
+        <w:pBdr>
+          <w:bottom w:val="single" w:sz="12" w:space="4" w:color="1F4E79"/>
+        </w:pBdr>
       </w:pPr>
       <w:r>
         <w:rPr>
           <w:rFonts w:ascii="Calibri" w:hAnsi="Calibri"/>
           <w:b/>
+          <w:color w:val="1F4E79"/>
           <w:sz w:val="22"/>
         </w:rPr>
         <w:t>SUMMARY</w:t>
@@ -73,25 +84,30 @@
     </w:p>
     <w:p>
       <w:pPr>
-        <w:spacing w:after="80" w:before="0" w:line="259" w:lineRule="auto"/>
+        <w:spacing w:before="20" w:after="20" w:line="259" w:lineRule="auto"/>
       </w:pPr>
       <w:r>
         <w:rPr>
           <w:rFonts w:ascii="Calibri" w:hAnsi="Calibri"/>
           <w:b w:val="0"/>
-          <w:sz w:val="20"/>
+          <w:color w:val="1A1A1A"/>
+          <w:sz w:val="21"/>
         </w:rPr>
-        <w:t>Front-end engineer with 8+ years shipping Angular SaaS — occupancy and property analytics, ad-tracking dashboards, and enterprise data-governance UIs. Strong at turning Figma, PSDs, and screenshots into production apps: TypeScript, RxJS, signals, Material, and chart/floor-plan tooling. Also builds AI-facing UI (chat, completion, local models). Bids as an individual contractor on Upwork for long-term Angular work.</w:t>
+        <w:t>Front-end engineer with 8+ years building Angular SaaS for analytics, ad tracking, data governance, and property analysis. I take products from design (Figma, PSD, screenshot) to shipped UI: dashboards, floor plans, role-based views, and forms that hold up under real data. Also ships AI-facing interfaces — chat, completion, and local models. Bids as an individual on Upwork for long-term Angular work.</w:t>
       </w:r>
     </w:p>
     <w:p>
       <w:pPr>
-        <w:spacing w:after="60" w:before="200" w:line="259" w:lineRule="auto"/>
+        <w:spacing w:before="200" w:after="60" w:line="259" w:lineRule="auto"/>
+        <w:pBdr>
+          <w:bottom w:val="single" w:sz="12" w:space="4" w:color="1F4E79"/>
+        </w:pBdr>
       </w:pPr>
       <w:r>
         <w:rPr>
           <w:rFonts w:ascii="Calibri" w:hAnsi="Calibri"/>
           <w:b/>
+          <w:color w:val="1F4E79"/>
           <w:sz w:val="22"/>
         </w:rPr>
         <w:t>EXPERIENCE</w:t>
@@ -99,284 +115,318 @@
     </w:p>
     <w:p>
       <w:pPr>
-        <w:spacing w:after="20" w:before="160" w:line="259" w:lineRule="auto"/>
+        <w:spacing w:before="120" w:after="0" w:line="259" w:lineRule="auto"/>
       </w:pPr>
       <w:r>
         <w:rPr>
           <w:rFonts w:ascii="Calibri" w:hAnsi="Calibri"/>
           <w:b/>
-          <w:sz w:val="21"/>
+          <w:color w:val="1A2B3C"/>
+          <w:sz w:val="22"/>
         </w:rPr>
         <w:t>Front-end engineer, Upwork</w:t>
+      </w:r>
+      <w:r>
+        <w:rPr>
+          <w:rFonts w:ascii="Calibri" w:hAnsi="Calibri"/>
+          <w:b w:val="0"/>
+          <w:color w:val="4A5563"/>
+          <w:sz w:val="20"/>
+        </w:rPr>
+        <w:t xml:space="preserve">   Sep 2022 – Present  ·  Freelance (individual)</w:t>
       </w:r>
     </w:p>
     <w:p>
       <w:pPr>
-        <w:spacing w:after="60" w:before="0" w:line="259" w:lineRule="auto"/>
+        <w:spacing w:before="0" w:after="20" w:line="259" w:lineRule="auto"/>
       </w:pPr>
       <w:r>
         <w:rPr>
           <w:rFonts w:ascii="Calibri" w:hAnsi="Calibri"/>
           <w:b w:val="0"/>
-          <w:sz w:val="19"/>
+          <w:color w:val="4A5563"/>
+          <w:sz w:val="20"/>
         </w:rPr>
-        <w:t>Sep 2022 – Present  ·  Freelance (individual)  ·  Long-term Angular SaaS contracts</w:t>
+        <w:t>Long-term Angular SaaS contracts. Dashboards, interactive plans, role-based analytics.</w:t>
       </w:r>
     </w:p>
     <w:p>
       <w:pPr>
-        <w:spacing w:after="40" w:before="0"/>
-        <w:ind w:left="216"/>
+        <w:spacing w:before="20" w:after="20" w:line="259" w:lineRule="auto"/>
       </w:pPr>
       <w:r>
         <w:rPr>
           <w:rFonts w:ascii="Calibri" w:hAnsi="Calibri"/>
           <w:b w:val="0"/>
-          <w:sz w:val="20"/>
+          <w:color w:val="1A1A1A"/>
+          <w:sz w:val="21"/>
         </w:rPr>
-        <w:t>•  Contract front-end work on Angular SaaS products: dashboards, interactive floor plans (FabricJS), and role-based analytics views (GoodData).</w:t>
+        <w:t>•  Built interactive floor-plan tooling (FabricJS) and role-based analytics views (GoodData) for occupancy-style SaaS products.</w:t>
       </w:r>
     </w:p>
     <w:p>
       <w:pPr>
-        <w:spacing w:after="40" w:before="0"/>
-        <w:ind w:left="216"/>
+        <w:spacing w:before="20" w:after="20" w:line="259" w:lineRule="auto"/>
       </w:pPr>
       <w:r>
         <w:rPr>
           <w:rFonts w:ascii="Calibri" w:hAnsi="Calibri"/>
           <w:b w:val="0"/>
-          <w:sz w:val="20"/>
+          <w:color w:val="1A1A1A"/>
+          <w:sz w:val="21"/>
         </w:rPr>
-        <w:t>•  Own design-to-production delivery — components, states, live data (RxJS), and maintainable module structure for multi-year products.</w:t>
+        <w:t>•  Owned design-to-production delivery in TypeScript/Angular — components, states, RxJS live updates, maintainable module structure.</w:t>
       </w:r>
     </w:p>
     <w:p>
       <w:pPr>
-        <w:spacing w:after="40" w:before="0"/>
-        <w:ind w:left="216"/>
+        <w:spacing w:before="20" w:after="20" w:line="259" w:lineRule="auto"/>
       </w:pPr>
       <w:r>
         <w:rPr>
           <w:rFonts w:ascii="Calibri" w:hAnsi="Calibri"/>
           <w:b w:val="0"/>
-          <w:sz w:val="20"/>
+          <w:color w:val="1A1A1A"/>
+          <w:sz w:val="21"/>
         </w:rPr>
-        <w:t>•  Improve application load behaviour with lazy loading and tighter data fetching on dashboard-heavy UIs.</w:t>
+        <w:t>•  Improved load behaviour on dashboard-heavy UIs with lazy loading and tighter data fetching.</w:t>
       </w:r>
     </w:p>
     <w:p>
       <w:pPr>
-        <w:spacing w:after="40" w:before="0"/>
-        <w:ind w:left="216"/>
+        <w:spacing w:before="120" w:after="0" w:line="259" w:lineRule="auto"/>
+      </w:pPr>
+      <w:r>
+        <w:rPr>
+          <w:rFonts w:ascii="Calibri" w:hAnsi="Calibri"/>
+          <w:b/>
+          <w:color w:val="1A2B3C"/>
+          <w:sz w:val="22"/>
+        </w:rPr>
+        <w:t>Front-end engineer, Appcarry</w:t>
+      </w:r>
+      <w:r>
+        <w:rPr>
+          <w:rFonts w:ascii="Calibri" w:hAnsi="Calibri"/>
+          <w:b w:val="0"/>
+          <w:color w:val="4A5563"/>
+          <w:sz w:val="20"/>
+        </w:rPr>
+        <w:t xml:space="preserve">   May 2020 – Oct 2024  ·  Part-time, India</w:t>
+      </w:r>
+    </w:p>
+    <w:p>
+      <w:pPr>
+        <w:spacing w:before="0" w:after="20" w:line="259" w:lineRule="auto"/>
       </w:pPr>
       <w:r>
         <w:rPr>
           <w:rFonts w:ascii="Calibri" w:hAnsi="Calibri"/>
           <w:b w:val="0"/>
+          <w:color w:val="4A5563"/>
           <w:sz w:val="20"/>
         </w:rPr>
-        <w:t>•  Prefer long engagements (3+ months) with verified US/Canada clients; work as an individual, not an agency.</w:t>
+        <w:t>Performance-marketing and ad-tracking SaaS. Angular 12 → 17. Ran alongside full-time work 2020–2022.</w:t>
       </w:r>
     </w:p>
     <w:p>
       <w:pPr>
-        <w:spacing w:after="20" w:before="160" w:line="259" w:lineRule="auto"/>
-      </w:pPr>
-      <w:r>
-        <w:rPr>
-          <w:rFonts w:ascii="Calibri" w:hAnsi="Calibri"/>
-          <w:b/>
-          <w:sz w:val="21"/>
-        </w:rPr>
-        <w:t>Front-end engineer, Appcarry</w:t>
-      </w:r>
-    </w:p>
-    <w:p>
-      <w:pPr>
-        <w:spacing w:after="60" w:before="0" w:line="259" w:lineRule="auto"/>
+        <w:spacing w:before="20" w:after="20" w:line="259" w:lineRule="auto"/>
       </w:pPr>
       <w:r>
         <w:rPr>
           <w:rFonts w:ascii="Calibri" w:hAnsi="Calibri"/>
           <w:b w:val="0"/>
-          <w:sz w:val="19"/>
+          <w:color w:val="1A1A1A"/>
+          <w:sz w:val="21"/>
         </w:rPr>
-        <w:t>May 2020 – Oct 2024  ·  Part-time  ·  India</w:t>
+        <w:t>•  Built analytics dashboards and charted reports for impressions, events, conversions, and installs.</w:t>
       </w:r>
     </w:p>
     <w:p>
       <w:pPr>
-        <w:spacing w:after="40" w:before="0"/>
-        <w:ind w:left="216"/>
+        <w:spacing w:before="20" w:after="20" w:line="259" w:lineRule="auto"/>
       </w:pPr>
       <w:r>
         <w:rPr>
           <w:rFonts w:ascii="Calibri" w:hAnsi="Calibri"/>
           <w:b w:val="0"/>
-          <w:sz w:val="20"/>
-        </w:rPr>
-        <w:t>•  Built performance-marketing and ad-tracking dashboards for impressions, events, conversions, and installs (Angular 12 → 17).</w:t>
-      </w:r>
-    </w:p>
-    <w:p>
-      <w:pPr>
-        <w:spacing w:after="40" w:before="0"/>
-        <w:ind w:left="216"/>
-      </w:pPr>
-      <w:r>
-        <w:rPr>
-          <w:rFonts w:ascii="Calibri" w:hAnsi="Calibri"/>
-          <w:b w:val="0"/>
-          <w:sz w:val="20"/>
+          <w:color w:val="1A1A1A"/>
+          <w:sz w:val="21"/>
         </w:rPr>
         <w:t>•  Designed filterable report UIs and dynamic forms; modularised the app so it stayed maintainable as features grew.</w:t>
       </w:r>
     </w:p>
     <w:p>
       <w:pPr>
-        <w:spacing w:after="40" w:before="0"/>
-        <w:ind w:left="216"/>
+        <w:spacing w:before="20" w:after="20" w:line="259" w:lineRule="auto"/>
       </w:pPr>
       <w:r>
         <w:rPr>
           <w:rFonts w:ascii="Calibri" w:hAnsi="Calibri"/>
           <w:b w:val="0"/>
-          <w:sz w:val="20"/>
+          <w:color w:val="1A1A1A"/>
+          <w:sz w:val="21"/>
         </w:rPr>
-        <w:t>•  Added AI-facing UI: chat interfaces, OpenAI-style API integration, recommendations and text completion; local models via Ollama where useful.</w:t>
+        <w:t>•  Shipped AI UI — chat interfaces, OpenAI-style APIs, recommendations/text completion; local models with Ollama.</w:t>
       </w:r>
     </w:p>
     <w:p>
       <w:pPr>
-        <w:spacing w:after="40" w:before="0"/>
-        <w:ind w:left="216"/>
+        <w:spacing w:before="20" w:after="20" w:line="259" w:lineRule="auto"/>
       </w:pPr>
       <w:r>
         <w:rPr>
           <w:rFonts w:ascii="Calibri" w:hAnsi="Calibri"/>
           <w:b w:val="0"/>
-          <w:sz w:val="20"/>
+          <w:color w:val="1A1A1A"/>
+          <w:sz w:val="21"/>
         </w:rPr>
-        <w:t>•  Stabilised delivery with unit tests and performance work so new features landed on a reliable base.</w:t>
+        <w:t>•  Stabilised delivery with unit tests (Jasmine/Karma/Jest) and performance work under new features.</w:t>
       </w:r>
     </w:p>
     <w:p>
       <w:pPr>
-        <w:spacing w:after="20" w:before="160" w:line="259" w:lineRule="auto"/>
+        <w:spacing w:before="120" w:after="0" w:line="259" w:lineRule="auto"/>
       </w:pPr>
       <w:r>
         <w:rPr>
           <w:rFonts w:ascii="Calibri" w:hAnsi="Calibri"/>
           <w:b/>
-          <w:sz w:val="21"/>
+          <w:color w:val="1A2B3C"/>
+          <w:sz w:val="22"/>
         </w:rPr>
         <w:t>Senior front-end developer, Prospecta Software</w:t>
+      </w:r>
+      <w:r>
+        <w:rPr>
+          <w:rFonts w:ascii="Calibri" w:hAnsi="Calibri"/>
+          <w:b w:val="0"/>
+          <w:color w:val="4A5563"/>
+          <w:sz w:val="20"/>
+        </w:rPr>
+        <w:t xml:space="preserve">   Oct 2020 – Sep 2022  ·  Full-time, India</w:t>
       </w:r>
     </w:p>
     <w:p>
       <w:pPr>
-        <w:spacing w:after="60" w:before="0" w:line="259" w:lineRule="auto"/>
+        <w:spacing w:before="0" w:after="20" w:line="259" w:lineRule="auto"/>
       </w:pPr>
       <w:r>
         <w:rPr>
           <w:rFonts w:ascii="Calibri" w:hAnsi="Calibri"/>
           <w:b w:val="0"/>
-          <w:sz w:val="19"/>
+          <w:color w:val="4A5563"/>
+          <w:sz w:val="20"/>
         </w:rPr>
-        <w:t>Oct 2020 – Sep 2022  ·  Full-time  ·  India</w:t>
+        <w:t>Enterprise data-governance SaaS fed by a SAP interface.</w:t>
       </w:r>
     </w:p>
     <w:p>
       <w:pPr>
-        <w:spacing w:after="40" w:before="0"/>
-        <w:ind w:left="216"/>
+        <w:spacing w:before="20" w:after="20" w:line="259" w:lineRule="auto"/>
       </w:pPr>
       <w:r>
         <w:rPr>
           <w:rFonts w:ascii="Calibri" w:hAnsi="Calibri"/>
           <w:b w:val="0"/>
-          <w:sz w:val="20"/>
+          <w:color w:val="1A1A1A"/>
+          <w:sz w:val="21"/>
         </w:rPr>
-        <w:t>•  Data-governance and integration UIs on a SAP-fed enterprise platform handling large incoming datasets.</w:t>
+        <w:t>•  Improved UI across data integration, quality, and governance products handling large incoming datasets.</w:t>
       </w:r>
     </w:p>
     <w:p>
       <w:pPr>
-        <w:spacing w:after="40" w:before="0"/>
-        <w:ind w:left="216"/>
+        <w:spacing w:before="20" w:after="20" w:line="259" w:lineRule="auto"/>
       </w:pPr>
       <w:r>
         <w:rPr>
           <w:rFonts w:ascii="Calibri" w:hAnsi="Calibri"/>
           <w:b w:val="0"/>
-          <w:sz w:val="20"/>
+          <w:color w:val="1A1A1A"/>
+          <w:sz w:val="21"/>
         </w:rPr>
-        <w:t>•  Improved responsiveness and operator workflows across quality, integration, and 360° data views.</w:t>
+        <w:t>•  Kept screens responsive and aligned with how operators move through a 360° data view.</w:t>
       </w:r>
     </w:p>
     <w:p>
       <w:pPr>
-        <w:spacing w:after="20" w:before="160" w:line="259" w:lineRule="auto"/>
+        <w:spacing w:before="120" w:after="0" w:line="259" w:lineRule="auto"/>
       </w:pPr>
       <w:r>
         <w:rPr>
           <w:rFonts w:ascii="Calibri" w:hAnsi="Calibri"/>
           <w:b/>
-          <w:sz w:val="21"/>
+          <w:color w:val="1A2B3C"/>
+          <w:sz w:val="22"/>
         </w:rPr>
         <w:t>Senior front-end developer, Estater</w:t>
+      </w:r>
+      <w:r>
+        <w:rPr>
+          <w:rFonts w:ascii="Calibri" w:hAnsi="Calibri"/>
+          <w:b w:val="0"/>
+          <w:color w:val="4A5563"/>
+          <w:sz w:val="20"/>
+        </w:rPr>
+        <w:t xml:space="preserve">   Feb 2018 – May 2020  ·  Full-time, India</w:t>
       </w:r>
     </w:p>
     <w:p>
       <w:pPr>
-        <w:spacing w:after="60" w:before="0" w:line="259" w:lineRule="auto"/>
+        <w:spacing w:before="0" w:after="20" w:line="259" w:lineRule="auto"/>
       </w:pPr>
       <w:r>
         <w:rPr>
           <w:rFonts w:ascii="Calibri" w:hAnsi="Calibri"/>
           <w:b w:val="0"/>
-          <w:sz w:val="19"/>
+          <w:color w:val="4A5563"/>
+          <w:sz w:val="20"/>
         </w:rPr>
-        <w:t>Feb 2018 – May 2020  ·  Full-time  ·  India</w:t>
+        <w:t>Land survey and property analytics for Kuwait and Bahrain.</w:t>
       </w:r>
     </w:p>
     <w:p>
       <w:pPr>
-        <w:spacing w:after="40" w:before="0"/>
-        <w:ind w:left="216"/>
+        <w:spacing w:before="20" w:after="20" w:line="259" w:lineRule="auto"/>
       </w:pPr>
       <w:r>
         <w:rPr>
           <w:rFonts w:ascii="Calibri" w:hAnsi="Calibri"/>
           <w:b w:val="0"/>
-          <w:sz w:val="20"/>
+          <w:color w:val="1A1A1A"/>
+          <w:sz w:val="21"/>
         </w:rPr>
-        <w:t>•  Property-analysis tools for Kuwait and Bahrain: catchment analysis, price trends, and benchmarking.</w:t>
+        <w:t>•  Built customer-facing tools for catchment analysis, price trends, and property benchmarking in the GCC.</w:t>
       </w:r>
     </w:p>
     <w:p>
       <w:pPr>
-        <w:spacing w:after="40" w:before="0"/>
-        <w:ind w:left="216"/>
+        <w:spacing w:before="20" w:after="20" w:line="259" w:lineRule="auto"/>
       </w:pPr>
       <w:r>
         <w:rPr>
           <w:rFonts w:ascii="Calibri" w:hAnsi="Calibri"/>
           <w:b w:val="0"/>
-          <w:sz w:val="20"/>
+          <w:color w:val="1A1A1A"/>
+          <w:sz w:val="21"/>
         </w:rPr>
         <w:t>•  Digitised survey workflows, including CSV upload from legacy documents, so field data landed in the product instead of spreadsheets.</w:t>
       </w:r>
     </w:p>
     <w:p>
       <w:pPr>
-        <w:spacing w:after="60" w:before="200" w:line="259" w:lineRule="auto"/>
+        <w:spacing w:before="200" w:after="60" w:line="259" w:lineRule="auto"/>
+        <w:pBdr>
+          <w:bottom w:val="single" w:sz="12" w:space="4" w:color="1F4E79"/>
+        </w:pBdr>
       </w:pPr>
       <w:r>
         <w:rPr>
           <w:rFonts w:ascii="Calibri" w:hAnsi="Calibri"/>
           <w:b/>
+          <w:color w:val="1F4E79"/>
           <w:sz w:val="22"/>
         </w:rPr>
         <w:t>SKILLS</w:t>
@@ -384,25 +434,154 @@
     </w:p>
     <w:p>
       <w:pPr>
-        <w:spacing w:after="80" w:before="0" w:line="259" w:lineRule="auto"/>
-      </w:pPr>
-      <w:r>
-        <w:rPr>
-          <w:rFonts w:ascii="Calibri" w:hAnsi="Calibri"/>
-          <w:b w:val="0"/>
-          <w:sz w:val="20"/>
-        </w:rPr>
-        <w:t>Angular (v2–v20), TypeScript, RxJS, signals, standalone components, Angular Material, SASS. Design-to-production (Figma, PSD, screenshots). Visualisation: FabricJS, GoodData, D3.js, Chart.js, Highcharts. REST, GraphQL, WebSockets. Tests: Jasmine, Karma, Jest, Cypress. Also React, Storybook, Laravel, CodeIgniter, Express.js, LoopBack. AI UI: chat, OpenAI-style APIs, Ollama.</w:t>
-      </w:r>
-    </w:p>
-    <w:p>
-      <w:pPr>
-        <w:spacing w:after="60" w:before="200" w:line="259" w:lineRule="auto"/>
+        <w:spacing w:before="20" w:after="20" w:line="259" w:lineRule="auto"/>
       </w:pPr>
       <w:r>
         <w:rPr>
           <w:rFonts w:ascii="Calibri" w:hAnsi="Calibri"/>
           <w:b/>
+          <w:color w:val="1A2B3C"/>
+          <w:sz w:val="21"/>
+        </w:rPr>
+        <w:t>Angular</w:t>
+      </w:r>
+      <w:r>
+        <w:rPr>
+          <w:rFonts w:ascii="Calibri" w:hAnsi="Calibri"/>
+          <w:b w:val="0"/>
+          <w:color w:val="1A1A1A"/>
+          <w:sz w:val="21"/>
+        </w:rPr>
+        <w:t xml:space="preserve">  v2–v20, TypeScript, RxJS, signals, standalone components, Angular Material, SASS</w:t>
+      </w:r>
+    </w:p>
+    <w:p>
+      <w:pPr>
+        <w:spacing w:before="20" w:after="20" w:line="259" w:lineRule="auto"/>
+      </w:pPr>
+      <w:r>
+        <w:rPr>
+          <w:rFonts w:ascii="Calibri" w:hAnsi="Calibri"/>
+          <w:b/>
+          <w:color w:val="1A2B3C"/>
+          <w:sz w:val="21"/>
+        </w:rPr>
+        <w:t>Product UI</w:t>
+      </w:r>
+      <w:r>
+        <w:rPr>
+          <w:rFonts w:ascii="Calibri" w:hAnsi="Calibri"/>
+          <w:b w:val="0"/>
+          <w:color w:val="1A1A1A"/>
+          <w:sz w:val="21"/>
+        </w:rPr>
+        <w:t xml:space="preserve">  Figma / PSD / screenshot → production; Storybook; design systems &amp; theming</w:t>
+      </w:r>
+    </w:p>
+    <w:p>
+      <w:pPr>
+        <w:spacing w:before="20" w:after="20" w:line="259" w:lineRule="auto"/>
+      </w:pPr>
+      <w:r>
+        <w:rPr>
+          <w:rFonts w:ascii="Calibri" w:hAnsi="Calibri"/>
+          <w:b/>
+          <w:color w:val="1A2B3C"/>
+          <w:sz w:val="21"/>
+        </w:rPr>
+        <w:t>Data on screen</w:t>
+      </w:r>
+      <w:r>
+        <w:rPr>
+          <w:rFonts w:ascii="Calibri" w:hAnsi="Calibri"/>
+          <w:b w:val="0"/>
+          <w:color w:val="1A1A1A"/>
+          <w:sz w:val="21"/>
+        </w:rPr>
+        <w:t xml:space="preserve">  FabricJS floor plans, GoodData, D3.js, Chart.js, Highcharts; REST, GraphQL, WebSockets</w:t>
+      </w:r>
+    </w:p>
+    <w:p>
+      <w:pPr>
+        <w:spacing w:before="20" w:after="20" w:line="259" w:lineRule="auto"/>
+      </w:pPr>
+      <w:r>
+        <w:rPr>
+          <w:rFonts w:ascii="Calibri" w:hAnsi="Calibri"/>
+          <w:b/>
+          <w:color w:val="1A2B3C"/>
+          <w:sz w:val="21"/>
+        </w:rPr>
+        <w:t>Quality</w:t>
+      </w:r>
+      <w:r>
+        <w:rPr>
+          <w:rFonts w:ascii="Calibri" w:hAnsi="Calibri"/>
+          <w:b w:val="0"/>
+          <w:color w:val="1A1A1A"/>
+          <w:sz w:val="21"/>
+        </w:rPr>
+        <w:t xml:space="preserve">  Jasmine, Karma, Jest, Cypress; performance and maintainable module structure</w:t>
+      </w:r>
+    </w:p>
+    <w:p>
+      <w:pPr>
+        <w:spacing w:before="20" w:after="20" w:line="259" w:lineRule="auto"/>
+      </w:pPr>
+      <w:r>
+        <w:rPr>
+          <w:rFonts w:ascii="Calibri" w:hAnsi="Calibri"/>
+          <w:b/>
+          <w:color w:val="1A2B3C"/>
+          <w:sz w:val="21"/>
+        </w:rPr>
+        <w:t>AI front-end</w:t>
+      </w:r>
+      <w:r>
+        <w:rPr>
+          <w:rFonts w:ascii="Calibri" w:hAnsi="Calibri"/>
+          <w:b w:val="0"/>
+          <w:color w:val="1A1A1A"/>
+          <w:sz w:val="21"/>
+        </w:rPr>
+        <w:t xml:space="preserve">  Chat UIs, OpenAI-style APIs, Ollama / local models, recommendations &amp; completion</w:t>
+      </w:r>
+    </w:p>
+    <w:p>
+      <w:pPr>
+        <w:spacing w:before="20" w:after="20" w:line="259" w:lineRule="auto"/>
+      </w:pPr>
+      <w:r>
+        <w:rPr>
+          <w:rFonts w:ascii="Calibri" w:hAnsi="Calibri"/>
+          <w:b/>
+          <w:color w:val="1A2B3C"/>
+          <w:sz w:val="21"/>
+        </w:rPr>
+        <w:t>Also</w:t>
+      </w:r>
+      <w:r>
+        <w:rPr>
+          <w:rFonts w:ascii="Calibri" w:hAnsi="Calibri"/>
+          <w:b w:val="0"/>
+          <w:color w:val="1A1A1A"/>
+          <w:sz w:val="21"/>
+        </w:rPr>
+        <w:t xml:space="preserve">  React, Laravel, CodeIgniter, Express.js, LoopBack</w:t>
+      </w:r>
+    </w:p>
+    <w:p>
+      <w:pPr>
+        <w:spacing w:before="200" w:after="60" w:line="259" w:lineRule="auto"/>
+        <w:pBdr>
+          <w:bottom w:val="single" w:sz="12" w:space="4" w:color="1F4E79"/>
+        </w:pBdr>
+      </w:pPr>
+      <w:r>
+        <w:rPr>
+          <w:rFonts w:ascii="Calibri" w:hAnsi="Calibri"/>
+          <w:b/>
+          <w:color w:val="1F4E79"/>
           <w:sz w:val="22"/>
         </w:rPr>
         <w:t>EDUCATION</w:t>
@@ -410,20 +589,21 @@
     </w:p>
     <w:p>
       <w:pPr>
-        <w:spacing w:after="0" w:before="0" w:line="259" w:lineRule="auto"/>
+        <w:spacing w:before="40" w:after="0" w:line="259" w:lineRule="auto"/>
       </w:pPr>
       <w:r>
         <w:rPr>
           <w:rFonts w:ascii="Calibri" w:hAnsi="Calibri"/>
           <w:b w:val="0"/>
-          <w:sz w:val="20"/>
+          <w:color w:val="1A1A1A"/>
+          <w:sz w:val="21"/>
         </w:rPr>
         <w:t>Bachelor of Computer Applications, Jamia Hamdard University, New Delhi — 2012</w:t>
       </w:r>
     </w:p>
     <w:sectPr>
       <w:pgSz w:w="12240" w:h="15840"/>
-      <w:pgMar w:top="792" w:right="936" w:bottom="792" w:left="936" w:header="720" w:footer="720" w:gutter="0"/>
+      <w:pgMar w:top="792" w:right="1008" w:bottom="720" w:left="1008" w:header="720" w:footer="720" w:gutter="0"/>
       <w:cols w:space="720"/>
       <w:docGrid w:linePitch="360"/>
     </w:sectPr>

</xml_diff>

<commit_message>
Redesign the resume for scannability
Rebuild the downloadable resume with a hiring-manager-skim layout: bold job
titles with right-aligned dates, italic one-line role context, tight single-idea
bullets, and skills as labelled clusters in a two-column grid. Navy accent and
Calibri carried over from the earlier polished version. Fits on one page.
Facts unchanged: Upwork freelance, 8+ years, British spelling, no InnerSpace.

Co-authored-by: Shahnshah <shahnshahmalik@users.noreply.github.com>
</commit_message>
<xml_diff>
--- a/public/Shahnshah-Malik-Resume.docx
+++ b/public/Shahnshah-Malik-Resume.docx
@@ -1,16 +1,17 @@
 
 <file path=word/document.xml><?xml version="1.0" encoding="utf-8"?>
-<w:document xmlns:wpc="http://schemas.microsoft.com/office/word/2010/wordprocessingCanvas" xmlns:mo="http://schemas.microsoft.com/office/mac/office/2008/main" xmlns:mc="http://schemas.openxmlformats.org/markup-compatibility/2006" xmlns:mv="urn:schemas-microsoft-com:mac:vml" xmlns:o="urn:schemas-microsoft-com:office:office" xmlns:r="http://schemas.openxmlformats.org/officeDocument/2006/relationships" xmlns:m="http://schemas.openxmlformats.org/officeDocument/2006/math" xmlns:v="urn:schemas-microsoft-com:vml" xmlns:wp14="http://schemas.microsoft.com/office/word/2010/wordprocessingDrawing" xmlns:wp="http://schemas.openxmlformats.org/drawingml/2006/wordprocessingDrawing" xmlns:w10="urn:schemas-microsoft-com:office:word" xmlns:w="http://schemas.openxmlformats.org/wordprocessingml/2006/main" xmlns:w14="http://schemas.microsoft.com/office/word/2010/wordml" xmlns:wpg="http://schemas.microsoft.com/office/word/2010/wordprocessingGroup" xmlns:wpi="http://schemas.microsoft.com/office/word/2010/wordprocessingInk" xmlns:wne="http://schemas.microsoft.com/office/word/2006/wordml" xmlns:wps="http://schemas.microsoft.com/office/word/2010/wordprocessingShape" mc:Ignorable="w14 wp14">
+<w:document xmlns:mc="http://schemas.openxmlformats.org/markup-compatibility/2006" xmlns:r="http://schemas.openxmlformats.org/officeDocument/2006/relationships" xmlns:w="http://schemas.openxmlformats.org/wordprocessingml/2006/main" xmlns:w14="http://schemas.microsoft.com/office/word/2010/wordml" mc:Ignorable="w14">
   <w:body>
     <w:p>
       <w:pPr>
-        <w:spacing w:before="0" w:after="0" w:line="259" w:lineRule="auto"/>
+        <w:spacing w:before="0" w:after="0" w:line="240" w:lineRule="auto"/>
         <w:jc w:val="center"/>
       </w:pPr>
       <w:r>
         <w:rPr>
-          <w:rFonts w:ascii="Calibri" w:hAnsi="Calibri"/>
+          <w:rFonts w:ascii="Calibri" w:hAnsi="Calibri" w:eastAsia="Calibri"/>
           <w:b/>
+          <w:i w:val="0"/>
           <w:color w:val="1A2B3C"/>
           <w:sz w:val="36"/>
         </w:rPr>
@@ -19,28 +20,30 @@
     </w:p>
     <w:p>
       <w:pPr>
-        <w:spacing w:before="0" w:after="40" w:line="259" w:lineRule="auto"/>
+        <w:spacing w:before="0" w:after="24" w:line="240" w:lineRule="auto"/>
         <w:jc w:val="center"/>
       </w:pPr>
       <w:r>
         <w:rPr>
-          <w:rFonts w:ascii="Calibri" w:hAnsi="Calibri"/>
+          <w:rFonts w:ascii="Calibri" w:hAnsi="Calibri" w:eastAsia="Calibri"/>
           <w:b w:val="0"/>
+          <w:i w:val="0"/>
           <w:color w:val="1F4E79"/>
           <w:sz w:val="22"/>
         </w:rPr>
-        <w:t>Front-end engineer  ·  Angular SaaS  ·  Design to production</w:t>
+        <w:t>Front-end Engineer  ·  Angular SaaS  ·  Design to production</w:t>
       </w:r>
     </w:p>
     <w:p>
       <w:pPr>
-        <w:spacing w:before="0" w:after="120" w:line="259" w:lineRule="auto"/>
+        <w:spacing w:before="0" w:after="72" w:line="240" w:lineRule="auto"/>
         <w:jc w:val="center"/>
       </w:pPr>
       <w:r>
         <w:rPr>
-          <w:rFonts w:ascii="Calibri" w:hAnsi="Calibri"/>
+          <w:rFonts w:ascii="Calibri" w:hAnsi="Calibri" w:eastAsia="Calibri"/>
           <w:b w:val="0"/>
+          <w:i w:val="0"/>
           <w:color w:val="4A5563"/>
           <w:sz w:val="20"/>
         </w:rPr>
@@ -48,17 +51,16 @@
       </w:r>
       <w:r>
         <w:rPr>
-          <w:rFonts w:ascii="Calibri" w:hAnsi="Calibri"/>
-          <w:b w:val="0"/>
+          <w:rFonts w:ascii="Calibri" w:hAnsi="Calibri" w:eastAsia="Calibri"/>
           <w:color w:val="1A1A1A"/>
-          <w:sz w:val="20"/>
         </w:rPr>
         <w:br/>
       </w:r>
       <w:r>
         <w:rPr>
-          <w:rFonts w:ascii="Calibri" w:hAnsi="Calibri"/>
+          <w:rFonts w:ascii="Calibri" w:hAnsi="Calibri" w:eastAsia="Calibri"/>
           <w:b w:val="0"/>
+          <w:i w:val="0"/>
           <w:color w:val="4A5563"/>
           <w:sz w:val="20"/>
         </w:rPr>
@@ -67,15 +69,16 @@
     </w:p>
     <w:p>
       <w:pPr>
-        <w:spacing w:before="200" w:after="60" w:line="259" w:lineRule="auto"/>
+        <w:spacing w:before="140" w:after="40" w:line="240" w:lineRule="auto"/>
         <w:pBdr>
-          <w:bottom w:val="single" w:sz="12" w:space="4" w:color="1F4E79"/>
+          <w:bottom w:val="single" w:sz="8" w:space="1" w:color="1F4E79"/>
         </w:pBdr>
       </w:pPr>
       <w:r>
         <w:rPr>
-          <w:rFonts w:ascii="Calibri" w:hAnsi="Calibri"/>
+          <w:rFonts w:ascii="Calibri" w:hAnsi="Calibri" w:eastAsia="Calibri"/>
           <w:b/>
+          <w:i w:val="0"/>
           <w:color w:val="1F4E79"/>
           <w:sz w:val="22"/>
         </w:rPr>
@@ -84,29 +87,31 @@
     </w:p>
     <w:p>
       <w:pPr>
-        <w:spacing w:before="20" w:after="20" w:line="259" w:lineRule="auto"/>
+        <w:spacing w:before="16" w:after="14" w:line="240" w:lineRule="auto"/>
       </w:pPr>
       <w:r>
         <w:rPr>
-          <w:rFonts w:ascii="Calibri" w:hAnsi="Calibri"/>
+          <w:rFonts w:ascii="Calibri" w:hAnsi="Calibri" w:eastAsia="Calibri"/>
           <w:b w:val="0"/>
+          <w:i w:val="0"/>
           <w:color w:val="1A1A1A"/>
-          <w:sz w:val="21"/>
+          <w:sz w:val="20"/>
         </w:rPr>
-        <w:t>Front-end engineer with 8+ years building Angular SaaS for analytics, ad tracking, data governance, and property analysis. I take products from design (Figma, PSD, screenshot) to shipped UI: dashboards, floor plans, role-based views, and forms that hold up under real data. Also ships AI-facing interfaces — chat, completion, and local models. Bids as an individual on Upwork for long-term Angular work.</w:t>
+        <w:t>Front-end engineer with 8+ years building Angular SaaS for analytics, ad tracking, data governance, and property analysis. I take products from design (Figma, PSD, screenshot) to shipped UI — dashboards, floor plans, role-based views, and forms that hold up under real data. Also build AI-facing interfaces (chat, OpenAI-style APIs, local models). Bid as an individual on Upwork for long-term Angular work.</w:t>
       </w:r>
     </w:p>
     <w:p>
       <w:pPr>
-        <w:spacing w:before="200" w:after="60" w:line="259" w:lineRule="auto"/>
+        <w:spacing w:before="140" w:after="40" w:line="240" w:lineRule="auto"/>
         <w:pBdr>
-          <w:bottom w:val="single" w:sz="12" w:space="4" w:color="1F4E79"/>
+          <w:bottom w:val="single" w:sz="8" w:space="1" w:color="1F4E79"/>
         </w:pBdr>
       </w:pPr>
       <w:r>
         <w:rPr>
-          <w:rFonts w:ascii="Calibri" w:hAnsi="Calibri"/>
+          <w:rFonts w:ascii="Calibri" w:hAnsi="Calibri" w:eastAsia="Calibri"/>
           <w:b/>
+          <w:i w:val="0"/>
           <w:color w:val="1F4E79"/>
           <w:sz w:val="22"/>
         </w:rPr>
@@ -115,472 +120,760 @@
     </w:p>
     <w:p>
       <w:pPr>
-        <w:spacing w:before="120" w:after="0" w:line="259" w:lineRule="auto"/>
+        <w:spacing w:before="104" w:after="0" w:line="240" w:lineRule="auto"/>
+        <w:tabs>
+          <w:tab w:val="right" w:pos="10224"/>
+        </w:tabs>
       </w:pPr>
       <w:r>
         <w:rPr>
-          <w:rFonts w:ascii="Calibri" w:hAnsi="Calibri"/>
+          <w:rFonts w:ascii="Calibri" w:hAnsi="Calibri" w:eastAsia="Calibri"/>
           <w:b/>
+          <w:i w:val="0"/>
           <w:color w:val="1A2B3C"/>
           <w:sz w:val="22"/>
         </w:rPr>
-        <w:t>Front-end engineer, Upwork</w:t>
+        <w:t>Front-end Engineer, Upwork</w:t>
       </w:r>
       <w:r>
         <w:rPr>
-          <w:rFonts w:ascii="Calibri" w:hAnsi="Calibri"/>
+          <w:rFonts w:ascii="Calibri" w:hAnsi="Calibri" w:eastAsia="Calibri"/>
+        </w:rPr>
+        <w:tab/>
+      </w:r>
+      <w:r>
+        <w:rPr>
+          <w:rFonts w:ascii="Calibri" w:hAnsi="Calibri" w:eastAsia="Calibri"/>
           <w:b w:val="0"/>
+          <w:i w:val="0"/>
           <w:color w:val="4A5563"/>
           <w:sz w:val="20"/>
         </w:rPr>
-        <w:t xml:space="preserve">   Sep 2022 – Present  ·  Freelance (individual)</w:t>
+        <w:t>Sep 2022 – Present</w:t>
       </w:r>
     </w:p>
     <w:p>
       <w:pPr>
-        <w:spacing w:before="0" w:after="20" w:line="259" w:lineRule="auto"/>
+        <w:spacing w:before="0" w:after="14" w:line="240" w:lineRule="auto"/>
       </w:pPr>
       <w:r>
         <w:rPr>
-          <w:rFonts w:ascii="Calibri" w:hAnsi="Calibri"/>
+          <w:rFonts w:ascii="Calibri" w:hAnsi="Calibri" w:eastAsia="Calibri"/>
           <w:b w:val="0"/>
+          <w:i/>
           <w:color w:val="4A5563"/>
           <w:sz w:val="20"/>
         </w:rPr>
-        <w:t>Long-term Angular SaaS contracts. Dashboards, interactive plans, role-based analytics.</w:t>
+        <w:t>Freelance (individual)  ·  Long-term Angular SaaS contracts, US / Canada clients</w:t>
       </w:r>
     </w:p>
     <w:p>
       <w:pPr>
-        <w:spacing w:before="20" w:after="20" w:line="259" w:lineRule="auto"/>
+        <w:spacing w:before="10" w:after="10" w:line="240" w:lineRule="auto"/>
+        <w:ind w:left="288" w:hanging="216"/>
       </w:pPr>
       <w:r>
         <w:rPr>
-          <w:rFonts w:ascii="Calibri" w:hAnsi="Calibri"/>
+          <w:rFonts w:ascii="Calibri" w:hAnsi="Calibri" w:eastAsia="Calibri"/>
           <w:b w:val="0"/>
+          <w:i w:val="0"/>
           <w:color w:val="1A1A1A"/>
-          <w:sz w:val="21"/>
+          <w:sz w:val="20"/>
         </w:rPr>
         <w:t>•  Built interactive floor-plan tooling (FabricJS) and role-based analytics views (GoodData) for occupancy-style SaaS products.</w:t>
       </w:r>
     </w:p>
     <w:p>
       <w:pPr>
-        <w:spacing w:before="20" w:after="20" w:line="259" w:lineRule="auto"/>
+        <w:spacing w:before="10" w:after="10" w:line="240" w:lineRule="auto"/>
+        <w:ind w:left="288" w:hanging="216"/>
       </w:pPr>
       <w:r>
         <w:rPr>
-          <w:rFonts w:ascii="Calibri" w:hAnsi="Calibri"/>
+          <w:rFonts w:ascii="Calibri" w:hAnsi="Calibri" w:eastAsia="Calibri"/>
           <w:b w:val="0"/>
+          <w:i w:val="0"/>
           <w:color w:val="1A1A1A"/>
-          <w:sz w:val="21"/>
+          <w:sz w:val="20"/>
         </w:rPr>
-        <w:t>•  Owned design-to-production delivery in TypeScript/Angular — components, states, RxJS live updates, maintainable module structure.</w:t>
+        <w:t>•  Owned design-to-production delivery in TypeScript / Angular — components, state, RxJS live updates, maintainable modules.</w:t>
       </w:r>
     </w:p>
     <w:p>
       <w:pPr>
-        <w:spacing w:before="20" w:after="20" w:line="259" w:lineRule="auto"/>
+        <w:spacing w:before="10" w:after="10" w:line="240" w:lineRule="auto"/>
+        <w:ind w:left="288" w:hanging="216"/>
       </w:pPr>
       <w:r>
         <w:rPr>
-          <w:rFonts w:ascii="Calibri" w:hAnsi="Calibri"/>
+          <w:rFonts w:ascii="Calibri" w:hAnsi="Calibri" w:eastAsia="Calibri"/>
           <w:b w:val="0"/>
+          <w:i w:val="0"/>
           <w:color w:val="1A1A1A"/>
-          <w:sz w:val="21"/>
+          <w:sz w:val="20"/>
         </w:rPr>
         <w:t>•  Improved load behaviour on dashboard-heavy UIs with lazy loading and tighter data fetching.</w:t>
       </w:r>
     </w:p>
     <w:p>
       <w:pPr>
-        <w:spacing w:before="120" w:after="0" w:line="259" w:lineRule="auto"/>
+        <w:spacing w:before="104" w:after="0" w:line="240" w:lineRule="auto"/>
+        <w:tabs>
+          <w:tab w:val="right" w:pos="10224"/>
+        </w:tabs>
       </w:pPr>
       <w:r>
         <w:rPr>
-          <w:rFonts w:ascii="Calibri" w:hAnsi="Calibri"/>
+          <w:rFonts w:ascii="Calibri" w:hAnsi="Calibri" w:eastAsia="Calibri"/>
           <w:b/>
+          <w:i w:val="0"/>
           <w:color w:val="1A2B3C"/>
           <w:sz w:val="22"/>
         </w:rPr>
-        <w:t>Front-end engineer, Appcarry</w:t>
+        <w:t>Front-end Engineer, Appcarry</w:t>
       </w:r>
       <w:r>
         <w:rPr>
-          <w:rFonts w:ascii="Calibri" w:hAnsi="Calibri"/>
+          <w:rFonts w:ascii="Calibri" w:hAnsi="Calibri" w:eastAsia="Calibri"/>
+        </w:rPr>
+        <w:tab/>
+      </w:r>
+      <w:r>
+        <w:rPr>
+          <w:rFonts w:ascii="Calibri" w:hAnsi="Calibri" w:eastAsia="Calibri"/>
           <w:b w:val="0"/>
+          <w:i w:val="0"/>
           <w:color w:val="4A5563"/>
           <w:sz w:val="20"/>
         </w:rPr>
-        <w:t xml:space="preserve">   May 2020 – Oct 2024  ·  Part-time, India</w:t>
+        <w:t>May 2020 – Oct 2024</w:t>
       </w:r>
     </w:p>
     <w:p>
       <w:pPr>
-        <w:spacing w:before="0" w:after="20" w:line="259" w:lineRule="auto"/>
+        <w:spacing w:before="0" w:after="14" w:line="240" w:lineRule="auto"/>
       </w:pPr>
       <w:r>
         <w:rPr>
-          <w:rFonts w:ascii="Calibri" w:hAnsi="Calibri"/>
+          <w:rFonts w:ascii="Calibri" w:hAnsi="Calibri" w:eastAsia="Calibri"/>
           <w:b w:val="0"/>
+          <w:i/>
           <w:color w:val="4A5563"/>
           <w:sz w:val="20"/>
         </w:rPr>
-        <w:t>Performance-marketing and ad-tracking SaaS. Angular 12 → 17. Ran alongside full-time work 2020–2022.</w:t>
+        <w:t>Part-time, India  ·  Performance-marketing &amp; ad-tracking SaaS (Angular 12 → 17)</w:t>
       </w:r>
     </w:p>
     <w:p>
       <w:pPr>
-        <w:spacing w:before="20" w:after="20" w:line="259" w:lineRule="auto"/>
+        <w:spacing w:before="10" w:after="10" w:line="240" w:lineRule="auto"/>
+        <w:ind w:left="288" w:hanging="216"/>
       </w:pPr>
       <w:r>
         <w:rPr>
-          <w:rFonts w:ascii="Calibri" w:hAnsi="Calibri"/>
+          <w:rFonts w:ascii="Calibri" w:hAnsi="Calibri" w:eastAsia="Calibri"/>
           <w:b w:val="0"/>
+          <w:i w:val="0"/>
           <w:color w:val="1A1A1A"/>
-          <w:sz w:val="21"/>
+          <w:sz w:val="20"/>
         </w:rPr>
         <w:t>•  Built analytics dashboards and charted reports for impressions, events, conversions, and installs.</w:t>
       </w:r>
     </w:p>
     <w:p>
       <w:pPr>
-        <w:spacing w:before="20" w:after="20" w:line="259" w:lineRule="auto"/>
+        <w:spacing w:before="10" w:after="10" w:line="240" w:lineRule="auto"/>
+        <w:ind w:left="288" w:hanging="216"/>
       </w:pPr>
       <w:r>
         <w:rPr>
-          <w:rFonts w:ascii="Calibri" w:hAnsi="Calibri"/>
+          <w:rFonts w:ascii="Calibri" w:hAnsi="Calibri" w:eastAsia="Calibri"/>
           <w:b w:val="0"/>
+          <w:i w:val="0"/>
           <w:color w:val="1A1A1A"/>
-          <w:sz w:val="21"/>
+          <w:sz w:val="20"/>
         </w:rPr>
-        <w:t>•  Designed filterable report UIs and dynamic forms; modularised the app so it stayed maintainable as features grew.</w:t>
+        <w:t>•  Designed filterable report UIs and dynamic forms; modularised the app so it stayed maintainable.</w:t>
       </w:r>
     </w:p>
     <w:p>
       <w:pPr>
-        <w:spacing w:before="20" w:after="20" w:line="259" w:lineRule="auto"/>
+        <w:spacing w:before="10" w:after="10" w:line="240" w:lineRule="auto"/>
+        <w:ind w:left="288" w:hanging="216"/>
       </w:pPr>
       <w:r>
         <w:rPr>
-          <w:rFonts w:ascii="Calibri" w:hAnsi="Calibri"/>
+          <w:rFonts w:ascii="Calibri" w:hAnsi="Calibri" w:eastAsia="Calibri"/>
           <w:b w:val="0"/>
+          <w:i w:val="0"/>
           <w:color w:val="1A1A1A"/>
-          <w:sz w:val="21"/>
+          <w:sz w:val="20"/>
         </w:rPr>
-        <w:t>•  Shipped AI UI — chat interfaces, OpenAI-style APIs, recommendations/text completion; local models with Ollama.</w:t>
+        <w:t>•  Shipped AI UI — chat interfaces, OpenAI-style APIs, recommendations / completion; local models with Ollama.</w:t>
       </w:r>
     </w:p>
     <w:p>
       <w:pPr>
-        <w:spacing w:before="20" w:after="20" w:line="259" w:lineRule="auto"/>
+        <w:spacing w:before="10" w:after="10" w:line="240" w:lineRule="auto"/>
+        <w:ind w:left="288" w:hanging="216"/>
       </w:pPr>
       <w:r>
         <w:rPr>
-          <w:rFonts w:ascii="Calibri" w:hAnsi="Calibri"/>
+          <w:rFonts w:ascii="Calibri" w:hAnsi="Calibri" w:eastAsia="Calibri"/>
           <w:b w:val="0"/>
+          <w:i w:val="0"/>
           <w:color w:val="1A1A1A"/>
-          <w:sz w:val="21"/>
+          <w:sz w:val="20"/>
         </w:rPr>
-        <w:t>•  Stabilised delivery with unit tests (Jasmine/Karma/Jest) and performance work under new features.</w:t>
+        <w:t>•  Stabilised delivery with unit tests (Jasmine / Karma / Jest) and performance work.</w:t>
       </w:r>
     </w:p>
     <w:p>
       <w:pPr>
-        <w:spacing w:before="120" w:after="0" w:line="259" w:lineRule="auto"/>
+        <w:spacing w:before="104" w:after="0" w:line="240" w:lineRule="auto"/>
+        <w:tabs>
+          <w:tab w:val="right" w:pos="10224"/>
+        </w:tabs>
       </w:pPr>
       <w:r>
         <w:rPr>
-          <w:rFonts w:ascii="Calibri" w:hAnsi="Calibri"/>
+          <w:rFonts w:ascii="Calibri" w:hAnsi="Calibri" w:eastAsia="Calibri"/>
           <w:b/>
+          <w:i w:val="0"/>
           <w:color w:val="1A2B3C"/>
           <w:sz w:val="22"/>
         </w:rPr>
-        <w:t>Senior front-end developer, Prospecta Software</w:t>
+        <w:t>Senior Front-end Developer, Prospecta Software</w:t>
       </w:r>
       <w:r>
         <w:rPr>
-          <w:rFonts w:ascii="Calibri" w:hAnsi="Calibri"/>
+          <w:rFonts w:ascii="Calibri" w:hAnsi="Calibri" w:eastAsia="Calibri"/>
+        </w:rPr>
+        <w:tab/>
+      </w:r>
+      <w:r>
+        <w:rPr>
+          <w:rFonts w:ascii="Calibri" w:hAnsi="Calibri" w:eastAsia="Calibri"/>
           <w:b w:val="0"/>
+          <w:i w:val="0"/>
           <w:color w:val="4A5563"/>
           <w:sz w:val="20"/>
         </w:rPr>
-        <w:t xml:space="preserve">   Oct 2020 – Sep 2022  ·  Full-time, India</w:t>
+        <w:t>Oct 2020 – Sep 2022</w:t>
       </w:r>
     </w:p>
     <w:p>
       <w:pPr>
-        <w:spacing w:before="0" w:after="20" w:line="259" w:lineRule="auto"/>
+        <w:spacing w:before="0" w:after="14" w:line="240" w:lineRule="auto"/>
       </w:pPr>
       <w:r>
         <w:rPr>
-          <w:rFonts w:ascii="Calibri" w:hAnsi="Calibri"/>
+          <w:rFonts w:ascii="Calibri" w:hAnsi="Calibri" w:eastAsia="Calibri"/>
           <w:b w:val="0"/>
+          <w:i/>
           <w:color w:val="4A5563"/>
           <w:sz w:val="20"/>
         </w:rPr>
-        <w:t>Enterprise data-governance SaaS fed by a SAP interface.</w:t>
+        <w:t>Full-time, India  ·  Enterprise data-governance SaaS fed by a SAP interface</w:t>
       </w:r>
     </w:p>
     <w:p>
       <w:pPr>
-        <w:spacing w:before="20" w:after="20" w:line="259" w:lineRule="auto"/>
+        <w:spacing w:before="10" w:after="10" w:line="240" w:lineRule="auto"/>
+        <w:ind w:left="288" w:hanging="216"/>
       </w:pPr>
       <w:r>
         <w:rPr>
-          <w:rFonts w:ascii="Calibri" w:hAnsi="Calibri"/>
+          <w:rFonts w:ascii="Calibri" w:hAnsi="Calibri" w:eastAsia="Calibri"/>
           <w:b w:val="0"/>
+          <w:i w:val="0"/>
           <w:color w:val="1A1A1A"/>
-          <w:sz w:val="21"/>
+          <w:sz w:val="20"/>
         </w:rPr>
         <w:t>•  Improved UI across data integration, quality, and governance products handling large incoming datasets.</w:t>
       </w:r>
     </w:p>
     <w:p>
       <w:pPr>
-        <w:spacing w:before="20" w:after="20" w:line="259" w:lineRule="auto"/>
+        <w:spacing w:before="10" w:after="10" w:line="240" w:lineRule="auto"/>
+        <w:ind w:left="288" w:hanging="216"/>
       </w:pPr>
       <w:r>
         <w:rPr>
-          <w:rFonts w:ascii="Calibri" w:hAnsi="Calibri"/>
+          <w:rFonts w:ascii="Calibri" w:hAnsi="Calibri" w:eastAsia="Calibri"/>
           <w:b w:val="0"/>
+          <w:i w:val="0"/>
           <w:color w:val="1A1A1A"/>
-          <w:sz w:val="21"/>
+          <w:sz w:val="20"/>
         </w:rPr>
         <w:t>•  Kept screens responsive and aligned with how operators move through a 360° data view.</w:t>
       </w:r>
     </w:p>
     <w:p>
       <w:pPr>
-        <w:spacing w:before="120" w:after="0" w:line="259" w:lineRule="auto"/>
+        <w:spacing w:before="104" w:after="0" w:line="240" w:lineRule="auto"/>
+        <w:tabs>
+          <w:tab w:val="right" w:pos="10224"/>
+        </w:tabs>
       </w:pPr>
       <w:r>
         <w:rPr>
-          <w:rFonts w:ascii="Calibri" w:hAnsi="Calibri"/>
+          <w:rFonts w:ascii="Calibri" w:hAnsi="Calibri" w:eastAsia="Calibri"/>
           <w:b/>
+          <w:i w:val="0"/>
           <w:color w:val="1A2B3C"/>
           <w:sz w:val="22"/>
         </w:rPr>
-        <w:t>Senior front-end developer, Estater</w:t>
+        <w:t>Senior Front-end Developer, Estater</w:t>
       </w:r>
       <w:r>
         <w:rPr>
-          <w:rFonts w:ascii="Calibri" w:hAnsi="Calibri"/>
+          <w:rFonts w:ascii="Calibri" w:hAnsi="Calibri" w:eastAsia="Calibri"/>
+        </w:rPr>
+        <w:tab/>
+      </w:r>
+      <w:r>
+        <w:rPr>
+          <w:rFonts w:ascii="Calibri" w:hAnsi="Calibri" w:eastAsia="Calibri"/>
           <w:b w:val="0"/>
+          <w:i w:val="0"/>
           <w:color w:val="4A5563"/>
           <w:sz w:val="20"/>
         </w:rPr>
-        <w:t xml:space="preserve">   Feb 2018 – May 2020  ·  Full-time, India</w:t>
+        <w:t>Feb 2018 – May 2020</w:t>
       </w:r>
     </w:p>
     <w:p>
       <w:pPr>
-        <w:spacing w:before="0" w:after="20" w:line="259" w:lineRule="auto"/>
+        <w:spacing w:before="0" w:after="14" w:line="240" w:lineRule="auto"/>
       </w:pPr>
       <w:r>
         <w:rPr>
-          <w:rFonts w:ascii="Calibri" w:hAnsi="Calibri"/>
+          <w:rFonts w:ascii="Calibri" w:hAnsi="Calibri" w:eastAsia="Calibri"/>
           <w:b w:val="0"/>
+          <w:i/>
           <w:color w:val="4A5563"/>
           <w:sz w:val="20"/>
         </w:rPr>
-        <w:t>Land survey and property analytics for Kuwait and Bahrain.</w:t>
+        <w:t>Full-time, India  ·  Property analytics for Kuwait and Bahrain</w:t>
       </w:r>
     </w:p>
     <w:p>
       <w:pPr>
-        <w:spacing w:before="20" w:after="20" w:line="259" w:lineRule="auto"/>
+        <w:spacing w:before="10" w:after="10" w:line="240" w:lineRule="auto"/>
+        <w:ind w:left="288" w:hanging="216"/>
       </w:pPr>
       <w:r>
         <w:rPr>
-          <w:rFonts w:ascii="Calibri" w:hAnsi="Calibri"/>
+          <w:rFonts w:ascii="Calibri" w:hAnsi="Calibri" w:eastAsia="Calibri"/>
           <w:b w:val="0"/>
+          <w:i w:val="0"/>
           <w:color w:val="1A1A1A"/>
-          <w:sz w:val="21"/>
+          <w:sz w:val="20"/>
         </w:rPr>
         <w:t>•  Built customer-facing tools for catchment analysis, price trends, and property benchmarking in the GCC.</w:t>
       </w:r>
     </w:p>
     <w:p>
       <w:pPr>
-        <w:spacing w:before="20" w:after="20" w:line="259" w:lineRule="auto"/>
+        <w:spacing w:before="10" w:after="10" w:line="240" w:lineRule="auto"/>
+        <w:ind w:left="288" w:hanging="216"/>
       </w:pPr>
       <w:r>
         <w:rPr>
-          <w:rFonts w:ascii="Calibri" w:hAnsi="Calibri"/>
+          <w:rFonts w:ascii="Calibri" w:hAnsi="Calibri" w:eastAsia="Calibri"/>
           <w:b w:val="0"/>
+          <w:i w:val="0"/>
           <w:color w:val="1A1A1A"/>
-          <w:sz w:val="21"/>
+          <w:sz w:val="20"/>
         </w:rPr>
         <w:t>•  Digitised survey workflows, including CSV upload from legacy documents, so field data landed in the product instead of spreadsheets.</w:t>
       </w:r>
     </w:p>
     <w:p>
       <w:pPr>
-        <w:spacing w:before="200" w:after="60" w:line="259" w:lineRule="auto"/>
+        <w:spacing w:before="140" w:after="40" w:line="240" w:lineRule="auto"/>
         <w:pBdr>
-          <w:bottom w:val="single" w:sz="12" w:space="4" w:color="1F4E79"/>
+          <w:bottom w:val="single" w:sz="8" w:space="1" w:color="1F4E79"/>
         </w:pBdr>
       </w:pPr>
       <w:r>
         <w:rPr>
-          <w:rFonts w:ascii="Calibri" w:hAnsi="Calibri"/>
+          <w:rFonts w:ascii="Calibri" w:hAnsi="Calibri" w:eastAsia="Calibri"/>
           <w:b/>
+          <w:i w:val="0"/>
           <w:color w:val="1F4E79"/>
           <w:sz w:val="22"/>
         </w:rPr>
         <w:t>SKILLS</w:t>
       </w:r>
     </w:p>
+    <w:tbl>
+      <w:tblPr>
+        <w:tblW w:w="10224" w:type="dxa"/>
+        <w:tblBorders>
+          <w:top w:val="none" w:sz="0" w:space="0" w:color="auto"/>
+          <w:left w:val="none" w:sz="0" w:space="0" w:color="auto"/>
+          <w:bottom w:val="none" w:sz="0" w:space="0" w:color="auto"/>
+          <w:right w:val="none" w:sz="0" w:space="0" w:color="auto"/>
+          <w:insideH w:val="none" w:sz="0" w:space="0" w:color="auto"/>
+          <w:insideV w:val="none" w:sz="0" w:space="0" w:color="auto"/>
+        </w:tblBorders>
+        <w:tblLayout w:type="fixed"/>
+      </w:tblPr>
+      <w:tblGrid>
+        <w:gridCol w:w="2060"/>
+        <w:gridCol w:w="8164"/>
+      </w:tblGrid>
+      <w:tr>
+        <w:tc>
+          <w:tcPr>
+            <w:tcW w:w="2060" w:type="dxa"/>
+            <w:tcMar>
+              <w:top w:w="22" w:type="dxa"/>
+              <w:bottom w:w="22" w:type="dxa"/>
+              <w:left w:w="0" w:type="dxa"/>
+              <w:right w:w="0" w:type="dxa"/>
+            </w:tcMar>
+            <w:vAlign w:val="top"/>
+          </w:tcPr>
+          <w:p>
+            <w:pPr>
+              <w:spacing w:before="0" w:after="0" w:line="240" w:lineRule="auto"/>
+            </w:pPr>
+            <w:r>
+              <w:rPr>
+                <w:rFonts w:ascii="Calibri" w:hAnsi="Calibri" w:eastAsia="Calibri"/>
+                <w:b/>
+                <w:i w:val="0"/>
+                <w:color w:val="1F4E79"/>
+                <w:sz w:val="20"/>
+              </w:rPr>
+              <w:t>Angular</w:t>
+            </w:r>
+          </w:p>
+        </w:tc>
+        <w:tc>
+          <w:tcPr>
+            <w:tcW w:w="8164" w:type="dxa"/>
+            <w:tcMar>
+              <w:top w:w="22" w:type="dxa"/>
+              <w:bottom w:w="22" w:type="dxa"/>
+              <w:left w:w="0" w:type="dxa"/>
+              <w:right w:w="0" w:type="dxa"/>
+            </w:tcMar>
+            <w:vAlign w:val="top"/>
+          </w:tcPr>
+          <w:p>
+            <w:pPr>
+              <w:spacing w:before="0" w:after="0" w:line="240" w:lineRule="auto"/>
+            </w:pPr>
+            <w:r>
+              <w:rPr>
+                <w:rFonts w:ascii="Calibri" w:hAnsi="Calibri" w:eastAsia="Calibri"/>
+                <w:b w:val="0"/>
+                <w:i w:val="0"/>
+                <w:color w:val="1A1A1A"/>
+                <w:sz w:val="20"/>
+              </w:rPr>
+              <w:t>v2–v20, TypeScript, RxJS, signals, standalone components, Angular Material, SASS</w:t>
+            </w:r>
+          </w:p>
+        </w:tc>
+      </w:tr>
+      <w:tr>
+        <w:tc>
+          <w:tcPr>
+            <w:tcW w:w="2060" w:type="dxa"/>
+            <w:tcMar>
+              <w:top w:w="22" w:type="dxa"/>
+              <w:bottom w:w="22" w:type="dxa"/>
+              <w:left w:w="0" w:type="dxa"/>
+              <w:right w:w="0" w:type="dxa"/>
+            </w:tcMar>
+            <w:vAlign w:val="top"/>
+          </w:tcPr>
+          <w:p>
+            <w:pPr>
+              <w:spacing w:before="0" w:after="0" w:line="240" w:lineRule="auto"/>
+            </w:pPr>
+            <w:r>
+              <w:rPr>
+                <w:rFonts w:ascii="Calibri" w:hAnsi="Calibri" w:eastAsia="Calibri"/>
+                <w:b/>
+                <w:i w:val="0"/>
+                <w:color w:val="1F4E79"/>
+                <w:sz w:val="20"/>
+              </w:rPr>
+              <w:t>Product UI</w:t>
+            </w:r>
+          </w:p>
+        </w:tc>
+        <w:tc>
+          <w:tcPr>
+            <w:tcW w:w="8164" w:type="dxa"/>
+            <w:tcMar>
+              <w:top w:w="22" w:type="dxa"/>
+              <w:bottom w:w="22" w:type="dxa"/>
+              <w:left w:w="0" w:type="dxa"/>
+              <w:right w:w="0" w:type="dxa"/>
+            </w:tcMar>
+            <w:vAlign w:val="top"/>
+          </w:tcPr>
+          <w:p>
+            <w:pPr>
+              <w:spacing w:before="0" w:after="0" w:line="240" w:lineRule="auto"/>
+            </w:pPr>
+            <w:r>
+              <w:rPr>
+                <w:rFonts w:ascii="Calibri" w:hAnsi="Calibri" w:eastAsia="Calibri"/>
+                <w:b w:val="0"/>
+                <w:i w:val="0"/>
+                <w:color w:val="1A1A1A"/>
+                <w:sz w:val="20"/>
+              </w:rPr>
+              <w:t>Figma / PSD / screenshot → production; design systems &amp; theming</w:t>
+            </w:r>
+          </w:p>
+        </w:tc>
+      </w:tr>
+      <w:tr>
+        <w:tc>
+          <w:tcPr>
+            <w:tcW w:w="2060" w:type="dxa"/>
+            <w:tcMar>
+              <w:top w:w="22" w:type="dxa"/>
+              <w:bottom w:w="22" w:type="dxa"/>
+              <w:left w:w="0" w:type="dxa"/>
+              <w:right w:w="0" w:type="dxa"/>
+            </w:tcMar>
+            <w:vAlign w:val="top"/>
+          </w:tcPr>
+          <w:p>
+            <w:pPr>
+              <w:spacing w:before="0" w:after="0" w:line="240" w:lineRule="auto"/>
+            </w:pPr>
+            <w:r>
+              <w:rPr>
+                <w:rFonts w:ascii="Calibri" w:hAnsi="Calibri" w:eastAsia="Calibri"/>
+                <w:b/>
+                <w:i w:val="0"/>
+                <w:color w:val="1F4E79"/>
+                <w:sz w:val="20"/>
+              </w:rPr>
+              <w:t>Data on screen</w:t>
+            </w:r>
+          </w:p>
+        </w:tc>
+        <w:tc>
+          <w:tcPr>
+            <w:tcW w:w="8164" w:type="dxa"/>
+            <w:tcMar>
+              <w:top w:w="22" w:type="dxa"/>
+              <w:bottom w:w="22" w:type="dxa"/>
+              <w:left w:w="0" w:type="dxa"/>
+              <w:right w:w="0" w:type="dxa"/>
+            </w:tcMar>
+            <w:vAlign w:val="top"/>
+          </w:tcPr>
+          <w:p>
+            <w:pPr>
+              <w:spacing w:before="0" w:after="0" w:line="240" w:lineRule="auto"/>
+            </w:pPr>
+            <w:r>
+              <w:rPr>
+                <w:rFonts w:ascii="Calibri" w:hAnsi="Calibri" w:eastAsia="Calibri"/>
+                <w:b w:val="0"/>
+                <w:i w:val="0"/>
+                <w:color w:val="1A1A1A"/>
+                <w:sz w:val="20"/>
+              </w:rPr>
+              <w:t>FabricJS floor plans, GoodData, D3.js, Chart.js, Highcharts; REST, GraphQL, WebSockets</w:t>
+            </w:r>
+          </w:p>
+        </w:tc>
+      </w:tr>
+      <w:tr>
+        <w:tc>
+          <w:tcPr>
+            <w:tcW w:w="2060" w:type="dxa"/>
+            <w:tcMar>
+              <w:top w:w="22" w:type="dxa"/>
+              <w:bottom w:w="22" w:type="dxa"/>
+              <w:left w:w="0" w:type="dxa"/>
+              <w:right w:w="0" w:type="dxa"/>
+            </w:tcMar>
+            <w:vAlign w:val="top"/>
+          </w:tcPr>
+          <w:p>
+            <w:pPr>
+              <w:spacing w:before="0" w:after="0" w:line="240" w:lineRule="auto"/>
+            </w:pPr>
+            <w:r>
+              <w:rPr>
+                <w:rFonts w:ascii="Calibri" w:hAnsi="Calibri" w:eastAsia="Calibri"/>
+                <w:b/>
+                <w:i w:val="0"/>
+                <w:color w:val="1F4E79"/>
+                <w:sz w:val="20"/>
+              </w:rPr>
+              <w:t>AI front-end</w:t>
+            </w:r>
+          </w:p>
+        </w:tc>
+        <w:tc>
+          <w:tcPr>
+            <w:tcW w:w="8164" w:type="dxa"/>
+            <w:tcMar>
+              <w:top w:w="22" w:type="dxa"/>
+              <w:bottom w:w="22" w:type="dxa"/>
+              <w:left w:w="0" w:type="dxa"/>
+              <w:right w:w="0" w:type="dxa"/>
+            </w:tcMar>
+            <w:vAlign w:val="top"/>
+          </w:tcPr>
+          <w:p>
+            <w:pPr>
+              <w:spacing w:before="0" w:after="0" w:line="240" w:lineRule="auto"/>
+            </w:pPr>
+            <w:r>
+              <w:rPr>
+                <w:rFonts w:ascii="Calibri" w:hAnsi="Calibri" w:eastAsia="Calibri"/>
+                <w:b w:val="0"/>
+                <w:i w:val="0"/>
+                <w:color w:val="1A1A1A"/>
+                <w:sz w:val="20"/>
+              </w:rPr>
+              <w:t>Chat UIs, OpenAI-style APIs, Ollama / local models, recommendations &amp; completion</w:t>
+            </w:r>
+          </w:p>
+        </w:tc>
+      </w:tr>
+      <w:tr>
+        <w:tc>
+          <w:tcPr>
+            <w:tcW w:w="2060" w:type="dxa"/>
+            <w:tcMar>
+              <w:top w:w="22" w:type="dxa"/>
+              <w:bottom w:w="22" w:type="dxa"/>
+              <w:left w:w="0" w:type="dxa"/>
+              <w:right w:w="0" w:type="dxa"/>
+            </w:tcMar>
+            <w:vAlign w:val="top"/>
+          </w:tcPr>
+          <w:p>
+            <w:pPr>
+              <w:spacing w:before="0" w:after="0" w:line="240" w:lineRule="auto"/>
+            </w:pPr>
+            <w:r>
+              <w:rPr>
+                <w:rFonts w:ascii="Calibri" w:hAnsi="Calibri" w:eastAsia="Calibri"/>
+                <w:b/>
+                <w:i w:val="0"/>
+                <w:color w:val="1F4E79"/>
+                <w:sz w:val="20"/>
+              </w:rPr>
+              <w:t>Testing</w:t>
+            </w:r>
+          </w:p>
+        </w:tc>
+        <w:tc>
+          <w:tcPr>
+            <w:tcW w:w="8164" w:type="dxa"/>
+            <w:tcMar>
+              <w:top w:w="22" w:type="dxa"/>
+              <w:bottom w:w="22" w:type="dxa"/>
+              <w:left w:w="0" w:type="dxa"/>
+              <w:right w:w="0" w:type="dxa"/>
+            </w:tcMar>
+            <w:vAlign w:val="top"/>
+          </w:tcPr>
+          <w:p>
+            <w:pPr>
+              <w:spacing w:before="0" w:after="0" w:line="240" w:lineRule="auto"/>
+            </w:pPr>
+            <w:r>
+              <w:rPr>
+                <w:rFonts w:ascii="Calibri" w:hAnsi="Calibri" w:eastAsia="Calibri"/>
+                <w:b w:val="0"/>
+                <w:i w:val="0"/>
+                <w:color w:val="1A1A1A"/>
+                <w:sz w:val="20"/>
+              </w:rPr>
+              <w:t>Jasmine, Karma, Jest, Cypress</w:t>
+            </w:r>
+          </w:p>
+        </w:tc>
+      </w:tr>
+      <w:tr>
+        <w:tc>
+          <w:tcPr>
+            <w:tcW w:w="2060" w:type="dxa"/>
+            <w:tcMar>
+              <w:top w:w="22" w:type="dxa"/>
+              <w:bottom w:w="22" w:type="dxa"/>
+              <w:left w:w="0" w:type="dxa"/>
+              <w:right w:w="0" w:type="dxa"/>
+            </w:tcMar>
+            <w:vAlign w:val="top"/>
+          </w:tcPr>
+          <w:p>
+            <w:pPr>
+              <w:spacing w:before="0" w:after="0" w:line="240" w:lineRule="auto"/>
+            </w:pPr>
+            <w:r>
+              <w:rPr>
+                <w:rFonts w:ascii="Calibri" w:hAnsi="Calibri" w:eastAsia="Calibri"/>
+                <w:b/>
+                <w:i w:val="0"/>
+                <w:color w:val="1F4E79"/>
+                <w:sz w:val="20"/>
+              </w:rPr>
+              <w:t>Also</w:t>
+            </w:r>
+          </w:p>
+        </w:tc>
+        <w:tc>
+          <w:tcPr>
+            <w:tcW w:w="8164" w:type="dxa"/>
+            <w:tcMar>
+              <w:top w:w="22" w:type="dxa"/>
+              <w:bottom w:w="22" w:type="dxa"/>
+              <w:left w:w="0" w:type="dxa"/>
+              <w:right w:w="0" w:type="dxa"/>
+            </w:tcMar>
+            <w:vAlign w:val="top"/>
+          </w:tcPr>
+          <w:p>
+            <w:pPr>
+              <w:spacing w:before="0" w:after="0" w:line="240" w:lineRule="auto"/>
+            </w:pPr>
+            <w:r>
+              <w:rPr>
+                <w:rFonts w:ascii="Calibri" w:hAnsi="Calibri" w:eastAsia="Calibri"/>
+                <w:b w:val="0"/>
+                <w:i w:val="0"/>
+                <w:color w:val="1A1A1A"/>
+                <w:sz w:val="20"/>
+              </w:rPr>
+              <w:t>React, Storybook, Laravel, CodeIgniter, Express.js, LoopBack</w:t>
+            </w:r>
+          </w:p>
+        </w:tc>
+      </w:tr>
+    </w:tbl>
     <w:p>
       <w:pPr>
-        <w:spacing w:before="20" w:after="20" w:line="259" w:lineRule="auto"/>
-      </w:pPr>
-      <w:r>
-        <w:rPr>
-          <w:rFonts w:ascii="Calibri" w:hAnsi="Calibri"/>
-          <w:b/>
-          <w:color w:val="1A2B3C"/>
-          <w:sz w:val="21"/>
-        </w:rPr>
-        <w:t>Angular</w:t>
-      </w:r>
-      <w:r>
-        <w:rPr>
-          <w:rFonts w:ascii="Calibri" w:hAnsi="Calibri"/>
-          <w:b w:val="0"/>
-          <w:color w:val="1A1A1A"/>
-          <w:sz w:val="21"/>
-        </w:rPr>
-        <w:t xml:space="preserve">  v2–v20, TypeScript, RxJS, signals, standalone components, Angular Material, SASS</w:t>
-      </w:r>
-    </w:p>
-    <w:p>
-      <w:pPr>
-        <w:spacing w:before="20" w:after="20" w:line="259" w:lineRule="auto"/>
-      </w:pPr>
-      <w:r>
-        <w:rPr>
-          <w:rFonts w:ascii="Calibri" w:hAnsi="Calibri"/>
-          <w:b/>
-          <w:color w:val="1A2B3C"/>
-          <w:sz w:val="21"/>
-        </w:rPr>
-        <w:t>Product UI</w:t>
-      </w:r>
-      <w:r>
-        <w:rPr>
-          <w:rFonts w:ascii="Calibri" w:hAnsi="Calibri"/>
-          <w:b w:val="0"/>
-          <w:color w:val="1A1A1A"/>
-          <w:sz w:val="21"/>
-        </w:rPr>
-        <w:t xml:space="preserve">  Figma / PSD / screenshot → production; Storybook; design systems &amp; theming</w:t>
-      </w:r>
-    </w:p>
-    <w:p>
-      <w:pPr>
-        <w:spacing w:before="20" w:after="20" w:line="259" w:lineRule="auto"/>
-      </w:pPr>
-      <w:r>
-        <w:rPr>
-          <w:rFonts w:ascii="Calibri" w:hAnsi="Calibri"/>
-          <w:b/>
-          <w:color w:val="1A2B3C"/>
-          <w:sz w:val="21"/>
-        </w:rPr>
-        <w:t>Data on screen</w:t>
-      </w:r>
-      <w:r>
-        <w:rPr>
-          <w:rFonts w:ascii="Calibri" w:hAnsi="Calibri"/>
-          <w:b w:val="0"/>
-          <w:color w:val="1A1A1A"/>
-          <w:sz w:val="21"/>
-        </w:rPr>
-        <w:t xml:space="preserve">  FabricJS floor plans, GoodData, D3.js, Chart.js, Highcharts; REST, GraphQL, WebSockets</w:t>
-      </w:r>
-    </w:p>
-    <w:p>
-      <w:pPr>
-        <w:spacing w:before="20" w:after="20" w:line="259" w:lineRule="auto"/>
-      </w:pPr>
-      <w:r>
-        <w:rPr>
-          <w:rFonts w:ascii="Calibri" w:hAnsi="Calibri"/>
-          <w:b/>
-          <w:color w:val="1A2B3C"/>
-          <w:sz w:val="21"/>
-        </w:rPr>
-        <w:t>Quality</w:t>
-      </w:r>
-      <w:r>
-        <w:rPr>
-          <w:rFonts w:ascii="Calibri" w:hAnsi="Calibri"/>
-          <w:b w:val="0"/>
-          <w:color w:val="1A1A1A"/>
-          <w:sz w:val="21"/>
-        </w:rPr>
-        <w:t xml:space="preserve">  Jasmine, Karma, Jest, Cypress; performance and maintainable module structure</w:t>
-      </w:r>
-    </w:p>
-    <w:p>
-      <w:pPr>
-        <w:spacing w:before="20" w:after="20" w:line="259" w:lineRule="auto"/>
-      </w:pPr>
-      <w:r>
-        <w:rPr>
-          <w:rFonts w:ascii="Calibri" w:hAnsi="Calibri"/>
-          <w:b/>
-          <w:color w:val="1A2B3C"/>
-          <w:sz w:val="21"/>
-        </w:rPr>
-        <w:t>AI front-end</w:t>
-      </w:r>
-      <w:r>
-        <w:rPr>
-          <w:rFonts w:ascii="Calibri" w:hAnsi="Calibri"/>
-          <w:b w:val="0"/>
-          <w:color w:val="1A1A1A"/>
-          <w:sz w:val="21"/>
-        </w:rPr>
-        <w:t xml:space="preserve">  Chat UIs, OpenAI-style APIs, Ollama / local models, recommendations &amp; completion</w:t>
-      </w:r>
-    </w:p>
-    <w:p>
-      <w:pPr>
-        <w:spacing w:before="20" w:after="20" w:line="259" w:lineRule="auto"/>
-      </w:pPr>
-      <w:r>
-        <w:rPr>
-          <w:rFonts w:ascii="Calibri" w:hAnsi="Calibri"/>
-          <w:b/>
-          <w:color w:val="1A2B3C"/>
-          <w:sz w:val="21"/>
-        </w:rPr>
-        <w:t>Also</w:t>
-      </w:r>
-      <w:r>
-        <w:rPr>
-          <w:rFonts w:ascii="Calibri" w:hAnsi="Calibri"/>
-          <w:b w:val="0"/>
-          <w:color w:val="1A1A1A"/>
-          <w:sz w:val="21"/>
-        </w:rPr>
-        <w:t xml:space="preserve">  React, Laravel, CodeIgniter, Express.js, LoopBack</w:t>
-      </w:r>
-    </w:p>
-    <w:p>
-      <w:pPr>
-        <w:spacing w:before="200" w:after="60" w:line="259" w:lineRule="auto"/>
+        <w:spacing w:before="140" w:after="40" w:line="240" w:lineRule="auto"/>
         <w:pBdr>
-          <w:bottom w:val="single" w:sz="12" w:space="4" w:color="1F4E79"/>
+          <w:bottom w:val="single" w:sz="8" w:space="1" w:color="1F4E79"/>
         </w:pBdr>
       </w:pPr>
       <w:r>
         <w:rPr>
-          <w:rFonts w:ascii="Calibri" w:hAnsi="Calibri"/>
+          <w:rFonts w:ascii="Calibri" w:hAnsi="Calibri" w:eastAsia="Calibri"/>
           <w:b/>
+          <w:i w:val="0"/>
           <w:color w:val="1F4E79"/>
           <w:sz w:val="22"/>
         </w:rPr>
@@ -589,21 +882,22 @@
     </w:p>
     <w:p>
       <w:pPr>
-        <w:spacing w:before="40" w:after="0" w:line="259" w:lineRule="auto"/>
+        <w:spacing w:before="24" w:after="0" w:line="240" w:lineRule="auto"/>
       </w:pPr>
       <w:r>
         <w:rPr>
-          <w:rFonts w:ascii="Calibri" w:hAnsi="Calibri"/>
+          <w:rFonts w:ascii="Calibri" w:hAnsi="Calibri" w:eastAsia="Calibri"/>
           <w:b w:val="0"/>
+          <w:i w:val="0"/>
           <w:color w:val="1A1A1A"/>
-          <w:sz w:val="21"/>
+          <w:sz w:val="20"/>
         </w:rPr>
-        <w:t>Bachelor of Computer Applications, Jamia Hamdard University, New Delhi — 2012</w:t>
+        <w:t>Bachelor of Computer Applications (BCA) — Jamia Hamdard University, New Delhi  ·  2012</w:t>
       </w:r>
     </w:p>
     <w:sectPr>
       <w:pgSz w:w="12240" w:h="15840"/>
-      <w:pgMar w:top="792" w:right="1008" w:bottom="720" w:left="1008" w:header="720" w:footer="720" w:gutter="0"/>
+      <w:pgMar w:top="720" w:right="1008" w:bottom="648" w:left="1008" w:header="720" w:footer="720" w:gutter="0"/>
       <w:cols w:space="720"/>
       <w:docGrid w:linePitch="360"/>
     </w:sectPr>

</xml_diff>